<commit_message>
Add portal screenshot to README, include cover image and docx articles
Co-Authored-By: Claude Opus 4.6 (1M context) <noreply@anthropic.com>
</commit_message>
<xml_diff>
--- a/articles/linkedin_article.docx
+++ b/articles/linkedin_article.docx
@@ -1,14 +1,14 @@
 
 <file path=word/document.xml><?xml version="1.0" encoding="utf-8"?>
-<w:document xmlns:w="http://schemas.openxmlformats.org/wordprocessingml/2006/main" xmlns:m="http://schemas.openxmlformats.org/officeDocument/2006/math" xmlns:r="http://schemas.openxmlformats.org/officeDocument/2006/relationships" xmlns:o="urn:schemas-microsoft-com:office:office" xmlns:v="urn:schemas-microsoft-com:vml" xmlns:w10="urn:schemas-microsoft-com:office:word" xmlns:a="http://schemas.openxmlformats.org/drawingml/2006/main" xmlns:pic="http://schemas.openxmlformats.org/drawingml/2006/picture" xmlns:wp="http://schemas.openxmlformats.org/drawingml/2006/wordprocessingDrawing">
+<w:document xmlns:wpc="http://schemas.microsoft.com/office/word/2010/wordprocessingCanvas" xmlns:cx="http://schemas.microsoft.com/office/drawing/2014/chartex" xmlns:cx1="http://schemas.microsoft.com/office/drawing/2015/9/8/chartex" xmlns:cx2="http://schemas.microsoft.com/office/drawing/2015/10/21/chartex" xmlns:cx3="http://schemas.microsoft.com/office/drawing/2016/5/9/chartex" xmlns:cx4="http://schemas.microsoft.com/office/drawing/2016/5/10/chartex" xmlns:cx5="http://schemas.microsoft.com/office/drawing/2016/5/11/chartex" xmlns:cx6="http://schemas.microsoft.com/office/drawing/2016/5/12/chartex" xmlns:cx7="http://schemas.microsoft.com/office/drawing/2016/5/13/chartex" xmlns:cx8="http://schemas.microsoft.com/office/drawing/2016/5/14/chartex" xmlns:mc="http://schemas.openxmlformats.org/markup-compatibility/2006" xmlns:aink="http://schemas.microsoft.com/office/drawing/2016/ink" xmlns:am3d="http://schemas.microsoft.com/office/drawing/2017/model3d" xmlns:o="urn:schemas-microsoft-com:office:office" xmlns:oel="http://schemas.microsoft.com/office/2019/extlst" xmlns:r="http://schemas.openxmlformats.org/officeDocument/2006/relationships" xmlns:m="http://schemas.openxmlformats.org/officeDocument/2006/math" xmlns:v="urn:schemas-microsoft-com:vml" xmlns:wp14="http://schemas.microsoft.com/office/word/2010/wordprocessingDrawing" xmlns:wp="http://schemas.openxmlformats.org/drawingml/2006/wordprocessingDrawing" xmlns:w10="urn:schemas-microsoft-com:office:word" xmlns:w="http://schemas.openxmlformats.org/wordprocessingml/2006/main" xmlns:w14="http://schemas.microsoft.com/office/word/2010/wordml" xmlns:w15="http://schemas.microsoft.com/office/word/2012/wordml" xmlns:w16cex="http://schemas.microsoft.com/office/word/2018/wordml/cex" xmlns:w16cid="http://schemas.microsoft.com/office/word/2016/wordml/cid" xmlns:w16="http://schemas.microsoft.com/office/word/2018/wordml" xmlns:w16du="http://schemas.microsoft.com/office/word/2023/wordml/word16du" xmlns:w16sdtdh="http://schemas.microsoft.com/office/word/2020/wordml/sdtdatahash" xmlns:w16sdtfl="http://schemas.microsoft.com/office/word/2024/wordml/sdtformatlock" xmlns:w16se="http://schemas.microsoft.com/office/word/2015/wordml/symex" xmlns:wpg="http://schemas.microsoft.com/office/word/2010/wordprocessingGroup" xmlns:wpi="http://schemas.microsoft.com/office/word/2010/wordprocessingInk" xmlns:wne="http://schemas.microsoft.com/office/word/2006/wordml" xmlns:wps="http://schemas.microsoft.com/office/word/2010/wordprocessingShape" mc:Ignorable="w14 w15 w16se w16cid w16 w16cex w16sdtdh w16sdtfl w16du wp14">
   <w:body>
-    <w:bookmarkStart w:id="16" w:name="X7e93e0a2e1d4e2d2d16d1474ef722eda553dde2"/>
     <w:p>
       <w:pPr>
         <w:pStyle w:val="Heading1"/>
       </w:pPr>
-      <w:r>
-        <w:t xml:space="preserve">I Built a Zero-Config Research Workstation Dashboard – and Published It</w:t>
+      <w:bookmarkStart w:id="0" w:name="X7e93e0a2e1d4e2d2d16d1474ef722eda553dde2"/>
+      <w:r>
+        <w:t>I Built a Zero-Config Research Workstation Dashboard – and Published It</w:t>
       </w:r>
     </w:p>
     <w:p>
@@ -16,31 +16,25 @@
         <w:pStyle w:val="FirstParagraph"/>
       </w:pPr>
       <w:r>
-        <w:t xml:space="preserve">If you run ML experiments on a beefy Linux workstation, you know the drill: SSH in, run</w:t>
-      </w:r>
-      <w:r>
-        <w:t xml:space="preserve"> </w:t>
+        <w:t xml:space="preserve">If you run ML experiments on a beefy Linux workstation, you know the drill: SSH in, run </w:t>
       </w:r>
       <w:r>
         <w:rPr>
           <w:rStyle w:val="VerbatimChar"/>
         </w:rPr>
-        <w:t xml:space="preserve">nvidia-smi</w:t>
-      </w:r>
-      <w:r>
-        <w:t xml:space="preserve">, check</w:t>
-      </w:r>
-      <w:r>
-        <w:t xml:space="preserve"> </w:t>
+        <w:t>nvidia-smi</w:t>
+      </w:r>
+      <w:r>
+        <w:t xml:space="preserve">, check </w:t>
       </w:r>
       <w:r>
         <w:rPr>
           <w:rStyle w:val="VerbatimChar"/>
         </w:rPr>
-        <w:t xml:space="preserve">htop</w:t>
-      </w:r>
-      <w:r>
-        <w:t xml:space="preserve">, wonder which of your 44 CPU cores is actually doing something, and try to remember which tmux session has the training run that’s been going for 19 hours.</w:t>
+        <w:t>htop</w:t>
+      </w:r>
+      <w:r>
+        <w:t>, wonder which of your 44 CPU cores is actually doing something, and try to remember which tmux session has the training run that’s been going for 19 hours.</w:t>
       </w:r>
     </w:p>
     <w:p>
@@ -48,23 +42,17 @@
         <w:pStyle w:val="BodyText"/>
       </w:pPr>
       <w:r>
-        <w:t xml:space="preserve">I got tired of it. So I built</w:t>
-      </w:r>
-      <w:r>
-        <w:t xml:space="preserve"> </w:t>
+        <w:t xml:space="preserve">I got tired of it. So I built </w:t>
       </w:r>
       <w:r>
         <w:rPr>
           <w:b/>
           <w:bCs/>
         </w:rPr>
-        <w:t xml:space="preserve">research-portal</w:t>
-      </w:r>
-      <w:r>
-        <w:t xml:space="preserve"> </w:t>
-      </w:r>
-      <w:r>
-        <w:t xml:space="preserve">– a drop-in web dashboard that auto-discovers everything about your machine and every pipeline running on it. No config files. No YAML. No agent to install.</w:t>
+        <w:t>research-portal</w:t>
+      </w:r>
+      <w:r>
+        <w:t xml:space="preserve"> – a drop-in web dashboard that auto-discovers everything about your machine and every pipeline running on it. No config files. No YAML. No agent to install.</w:t>
       </w:r>
     </w:p>
     <w:p>
@@ -75,7 +63,7 @@
         <w:rPr>
           <w:rStyle w:val="VerbatimChar"/>
         </w:rPr>
-        <w:t xml:space="preserve">pip install research-portal</w:t>
+        <w:t>pip install research-portal</w:t>
       </w:r>
       <w:r>
         <w:br/>
@@ -84,7 +72,7 @@
         <w:rPr>
           <w:rStyle w:val="VerbatimChar"/>
         </w:rPr>
-        <w:t xml:space="preserve">research-portal</w:t>
+        <w:t>research-portal</w:t>
       </w:r>
     </w:p>
     <w:p>
@@ -92,16 +80,16 @@
         <w:pStyle w:val="FirstParagraph"/>
       </w:pPr>
       <w:r>
-        <w:t xml:space="preserve">That’s it. Open the URL in your browser.</w:t>
-      </w:r>
-    </w:p>
-    <w:bookmarkStart w:id="9" w:name="what-it-does"/>
+        <w:t>That’s it. Open the URL in your browser.</w:t>
+      </w:r>
+    </w:p>
     <w:p>
       <w:pPr>
         <w:pStyle w:val="Heading2"/>
       </w:pPr>
-      <w:r>
-        <w:t xml:space="preserve">What It Does</w:t>
+      <w:bookmarkStart w:id="1" w:name="what-it-does"/>
+      <w:r>
+        <w:t>What It Does</w:t>
       </w:r>
     </w:p>
     <w:p>
@@ -113,56 +101,44 @@
           <w:b/>
           <w:bCs/>
         </w:rPr>
-        <w:t xml:space="preserve">research-portal</w:t>
-      </w:r>
-      <w:r>
-        <w:t xml:space="preserve"> </w:t>
-      </w:r>
-      <w:r>
-        <w:t xml:space="preserve">reads directly from</w:t>
-      </w:r>
-      <w:r>
-        <w:t xml:space="preserve"> </w:t>
+        <w:t>research-portal</w:t>
+      </w:r>
+      <w:r>
+        <w:t xml:space="preserve"> reads directly from </w:t>
       </w:r>
       <w:r>
         <w:rPr>
           <w:rStyle w:val="VerbatimChar"/>
         </w:rPr>
-        <w:t xml:space="preserve">/proc</w:t>
-      </w:r>
-      <w:r>
-        <w:t xml:space="preserve">,</w:t>
-      </w:r>
-      <w:r>
-        <w:t xml:space="preserve"> </w:t>
+        <w:t>/proc</w:t>
+      </w:r>
+      <w:r>
+        <w:t xml:space="preserve">, </w:t>
       </w:r>
       <w:r>
         <w:rPr>
           <w:rStyle w:val="VerbatimChar"/>
         </w:rPr>
-        <w:t xml:space="preserve">nvidia-smi</w:t>
-      </w:r>
-      <w:r>
-        <w:t xml:space="preserve">,</w:t>
-      </w:r>
-      <w:r>
-        <w:t xml:space="preserve"> </w:t>
+        <w:t>nvidia-smi</w:t>
+      </w:r>
+      <w:r>
+        <w:t xml:space="preserve">, </w:t>
       </w:r>
       <w:r>
         <w:rPr>
           <w:rStyle w:val="VerbatimChar"/>
         </w:rPr>
-        <w:t xml:space="preserve">sensors</w:t>
-      </w:r>
-      <w:r>
-        <w:t xml:space="preserve">, and the process table to build a live picture of your workstation:</w:t>
+        <w:t>sensors</w:t>
+      </w:r>
+      <w:r>
+        <w:t>, and the process table to build a live picture of your workstation:</w:t>
       </w:r>
     </w:p>
     <w:p>
       <w:pPr>
         <w:numPr>
           <w:ilvl w:val="0"/>
-          <w:numId w:val="1001"/>
+          <w:numId w:val="2"/>
         </w:numPr>
       </w:pPr>
       <w:r>
@@ -170,20 +146,75 @@
           <w:b/>
           <w:bCs/>
         </w:rPr>
-        <w:t xml:space="preserve">Dashboard</w:t>
-      </w:r>
-      <w:r>
-        <w:t xml:space="preserve"> </w:t>
-      </w:r>
-      <w:r>
-        <w:t xml:space="preserve">– CPU package temperatures, GPU utilization/memory/thermals, RAM, disk, load averages, active tmux sessions. A dynamically generated Platform Guide shows your exact hardware specs, discovered at startup.</w:t>
+        <w:t>Dashboard</w:t>
+      </w:r>
+      <w:r>
+        <w:t xml:space="preserve"> – CPU package temperatures, GPU utilization/memory/thermals, RAM, disk, load averages, active tmux sessions. A dynamically generated Platform Guide shows your exact hardware specs, discovered at startup.</w:t>
+      </w:r>
+    </w:p>
+    <w:p>
+      <w:pPr>
+        <w:ind w:left="720"/>
+      </w:pPr>
+      <w:r>
+        <w:rPr>
+          <w:noProof/>
+        </w:rPr>
+        <w:drawing>
+          <wp:inline distT="0" distB="0" distL="0" distR="0" wp14:anchorId="7911DF65" wp14:editId="3C731C2D">
+            <wp:extent cx="4473604" cy="3589020"/>
+            <wp:effectExtent l="0" t="0" r="0" b="0"/>
+            <wp:docPr id="1884462350" name="Picture 1"/>
+            <wp:cNvGraphicFramePr>
+              <a:graphicFrameLocks xmlns:a="http://schemas.openxmlformats.org/drawingml/2006/main" noChangeAspect="1"/>
+            </wp:cNvGraphicFramePr>
+            <a:graphic xmlns:a="http://schemas.openxmlformats.org/drawingml/2006/main">
+              <a:graphicData uri="http://schemas.openxmlformats.org/drawingml/2006/picture">
+                <pic:pic xmlns:pic="http://schemas.openxmlformats.org/drawingml/2006/picture">
+                  <pic:nvPicPr>
+                    <pic:cNvPr id="0" name="Picture 2"/>
+                    <pic:cNvPicPr>
+                      <a:picLocks noChangeAspect="1" noChangeArrowheads="1"/>
+                    </pic:cNvPicPr>
+                  </pic:nvPicPr>
+                  <pic:blipFill>
+                    <a:blip r:embed="rId5" cstate="print">
+                      <a:extLst>
+                        <a:ext uri="{28A0092B-C50C-407E-A947-70E740481C1C}">
+                          <a14:useLocalDpi xmlns:a14="http://schemas.microsoft.com/office/drawing/2010/main" val="0"/>
+                        </a:ext>
+                      </a:extLst>
+                    </a:blip>
+                    <a:srcRect/>
+                    <a:stretch>
+                      <a:fillRect/>
+                    </a:stretch>
+                  </pic:blipFill>
+                  <pic:spPr bwMode="auto">
+                    <a:xfrm>
+                      <a:off x="0" y="0"/>
+                      <a:ext cx="4497312" cy="3608040"/>
+                    </a:xfrm>
+                    <a:prstGeom prst="rect">
+                      <a:avLst/>
+                    </a:prstGeom>
+                    <a:noFill/>
+                    <a:ln>
+                      <a:noFill/>
+                    </a:ln>
+                  </pic:spPr>
+                </pic:pic>
+              </a:graphicData>
+            </a:graphic>
+          </wp:inline>
+        </w:drawing>
       </w:r>
     </w:p>
     <w:p>
       <w:pPr>
         <w:numPr>
           <w:ilvl w:val="0"/>
-          <w:numId w:val="1001"/>
+          <w:numId w:val="2"/>
         </w:numPr>
       </w:pPr>
       <w:r>
@@ -191,20 +222,99 @@
           <w:b/>
           <w:bCs/>
         </w:rPr>
-        <w:t xml:space="preserve">Resource Map</w:t>
-      </w:r>
-      <w:r>
-        <w:t xml:space="preserve"> </w:t>
-      </w:r>
-      <w:r>
-        <w:t xml:space="preserve">– a per-core CPU grid (color-coded idle/low/med/high) showing which script is pinned to which core, plus per-GPU visual utilization bars. Think Google Maps, but for your hardware.</w:t>
+        <w:lastRenderedPageBreak/>
+        <w:t>Resource Map</w:t>
+      </w:r>
+      <w:r>
+        <w:t xml:space="preserve"> – a per-core CPU grid (color-coded idle/low/med/high) showing which script is pinned to which core, plus per-GPU visual utilization bars. </w:t>
+      </w:r>
+      <w:proofErr w:type="gramStart"/>
+      <w:r>
+        <w:t>Think</w:t>
+      </w:r>
+      <w:proofErr w:type="gramEnd"/>
+      <w:r>
+        <w:t xml:space="preserve"> Google Maps, but for your hardware.</w:t>
+      </w:r>
+    </w:p>
+    <w:p>
+      <w:pPr>
+        <w:ind w:left="720"/>
+      </w:pPr>
+      <w:r>
+        <w:rPr>
+          <w:noProof/>
+        </w:rPr>
+        <w:drawing>
+          <wp:inline distT="0" distB="0" distL="0" distR="0" wp14:anchorId="4003B440" wp14:editId="779223C4">
+            <wp:extent cx="5943600" cy="2490470"/>
+            <wp:effectExtent l="0" t="0" r="0" b="0"/>
+            <wp:docPr id="1271495619" name="Picture 2"/>
+            <wp:cNvGraphicFramePr>
+              <a:graphicFrameLocks xmlns:a="http://schemas.openxmlformats.org/drawingml/2006/main" noChangeAspect="1"/>
+            </wp:cNvGraphicFramePr>
+            <a:graphic xmlns:a="http://schemas.openxmlformats.org/drawingml/2006/main">
+              <a:graphicData uri="http://schemas.openxmlformats.org/drawingml/2006/picture">
+                <pic:pic xmlns:pic="http://schemas.openxmlformats.org/drawingml/2006/picture">
+                  <pic:nvPicPr>
+                    <pic:cNvPr id="0" name="Picture 3"/>
+                    <pic:cNvPicPr>
+                      <a:picLocks noChangeAspect="1" noChangeArrowheads="1"/>
+                    </pic:cNvPicPr>
+                  </pic:nvPicPr>
+                  <pic:blipFill>
+                    <a:blip r:embed="rId6" cstate="print">
+                      <a:extLst>
+                        <a:ext uri="{28A0092B-C50C-407E-A947-70E740481C1C}">
+                          <a14:useLocalDpi xmlns:a14="http://schemas.microsoft.com/office/drawing/2010/main" val="0"/>
+                        </a:ext>
+                      </a:extLst>
+                    </a:blip>
+                    <a:srcRect/>
+                    <a:stretch>
+                      <a:fillRect/>
+                    </a:stretch>
+                  </pic:blipFill>
+                  <pic:spPr bwMode="auto">
+                    <a:xfrm>
+                      <a:off x="0" y="0"/>
+                      <a:ext cx="5943600" cy="2490470"/>
+                    </a:xfrm>
+                    <a:prstGeom prst="rect">
+                      <a:avLst/>
+                    </a:prstGeom>
+                    <a:noFill/>
+                    <a:ln>
+                      <a:noFill/>
+                    </a:ln>
+                  </pic:spPr>
+                </pic:pic>
+              </a:graphicData>
+            </a:graphic>
+          </wp:inline>
+        </w:drawing>
+      </w:r>
+    </w:p>
+    <w:p>
+      <w:pPr>
+        <w:rPr>
+          <w:b/>
+          <w:bCs/>
+        </w:rPr>
+      </w:pPr>
+      <w:r>
+        <w:rPr>
+          <w:b/>
+          <w:bCs/>
+        </w:rPr>
+        <w:br w:type="page"/>
       </w:r>
     </w:p>
     <w:p>
       <w:pPr>
         <w:numPr>
           <w:ilvl w:val="0"/>
-          <w:numId w:val="1001"/>
+          <w:numId w:val="2"/>
         </w:numPr>
       </w:pPr>
       <w:r>
@@ -212,77 +322,120 @@
           <w:b/>
           <w:bCs/>
         </w:rPr>
-        <w:t xml:space="preserve">Pipeline Flow</w:t>
-      </w:r>
-      <w:r>
-        <w:t xml:space="preserve"> </w:t>
-      </w:r>
-      <w:r>
-        <w:t xml:space="preserve">– automatically discovers every running Python or bash pipeline from the process table. Shows CPU/memory per process, which GPU it’s using (read from</w:t>
-      </w:r>
-      <w:r>
-        <w:t xml:space="preserve"> </w:t>
+        <w:lastRenderedPageBreak/>
+        <w:t>Pipeline Flow</w:t>
+      </w:r>
+      <w:r>
+        <w:t xml:space="preserve"> – automatically discovers every running Python or bash pipeline from the process table. Shows CPU/memory per process, which GPU it’s using (read from </w:t>
       </w:r>
       <w:r>
         <w:rPr>
           <w:rStyle w:val="VerbatimChar"/>
         </w:rPr>
-        <w:t xml:space="preserve">CUDA_VISIBLE_DEVICES</w:t>
-      </w:r>
-      <w:r>
-        <w:t xml:space="preserve"> </w:t>
-      </w:r>
-      <w:r>
-        <w:t xml:space="preserve">in</w:t>
-      </w:r>
-      <w:r>
-        <w:t xml:space="preserve"> </w:t>
+        <w:t>CUDA_VISIBLE_DEVICES</w:t>
+      </w:r>
+      <w:r>
+        <w:t xml:space="preserve"> in </w:t>
       </w:r>
       <w:r>
         <w:rPr>
           <w:rStyle w:val="VerbatimChar"/>
         </w:rPr>
-        <w:t xml:space="preserve">/proc/pid/environ</w:t>
-      </w:r>
-      <w:r>
-        <w:t xml:space="preserve">), fold progress parsed from log files, and a pulsing animation for active stages. When a job finishes, it’s remembered as</w:t>
-      </w:r>
-      <w:r>
-        <w:t xml:space="preserve"> </w:t>
-      </w:r>
-      <w:r>
-        <w:t xml:space="preserve">“completed”</w:t>
-      </w:r>
-      <w:r>
-        <w:t xml:space="preserve"> </w:t>
-      </w:r>
-      <w:r>
-        <w:t xml:space="preserve">with elapsed time. Drop</w:t>
-      </w:r>
-      <w:r>
-        <w:t xml:space="preserve"> </w:t>
+        <w:t>/proc/pid/environ</w:t>
+      </w:r>
+      <w:r>
+        <w:t xml:space="preserve">), fold progress parsed from log files, and a pulsing animation for active stages. When a job finishes, it’s remembered as “completed” with elapsed time. Drop </w:t>
       </w:r>
       <w:r>
         <w:rPr>
           <w:rStyle w:val="VerbatimChar"/>
         </w:rPr>
-        <w:t xml:space="preserve">result_*.json</w:t>
-      </w:r>
-      <w:r>
-        <w:t xml:space="preserve"> </w:t>
-      </w:r>
-      <w:r>
-        <w:t xml:space="preserve">files in a directory and the portal picks them up with scores and metrics.</w:t>
-      </w:r>
-    </w:p>
-    <w:bookmarkEnd w:id="9"/>
-    <w:bookmarkStart w:id="10" w:name="the-design-philosophy"/>
+        <w:t>result_*.json</w:t>
+      </w:r>
+      <w:r>
+        <w:t xml:space="preserve"> files in a directory and the portal picks them up with scores and metrics.</w:t>
+      </w:r>
+    </w:p>
+    <w:p>
+      <w:pPr>
+        <w:ind w:left="720"/>
+      </w:pPr>
+      <w:r>
+        <w:rPr>
+          <w:noProof/>
+        </w:rPr>
+        <w:drawing>
+          <wp:inline distT="0" distB="0" distL="0" distR="0" wp14:anchorId="1FA10A0E" wp14:editId="4D094468">
+            <wp:extent cx="5941060" cy="5789295"/>
+            <wp:effectExtent l="0" t="0" r="0" b="0"/>
+            <wp:docPr id="1150667837" name="Picture 3"/>
+            <wp:cNvGraphicFramePr>
+              <a:graphicFrameLocks xmlns:a="http://schemas.openxmlformats.org/drawingml/2006/main" noChangeAspect="1"/>
+            </wp:cNvGraphicFramePr>
+            <a:graphic xmlns:a="http://schemas.openxmlformats.org/drawingml/2006/main">
+              <a:graphicData uri="http://schemas.openxmlformats.org/drawingml/2006/picture">
+                <pic:pic xmlns:pic="http://schemas.openxmlformats.org/drawingml/2006/picture">
+                  <pic:nvPicPr>
+                    <pic:cNvPr id="0" name="Picture 9"/>
+                    <pic:cNvPicPr>
+                      <a:picLocks noChangeAspect="1" noChangeArrowheads="1"/>
+                    </pic:cNvPicPr>
+                  </pic:nvPicPr>
+                  <pic:blipFill>
+                    <a:blip r:embed="rId7" cstate="print">
+                      <a:extLst>
+                        <a:ext uri="{28A0092B-C50C-407E-A947-70E740481C1C}">
+                          <a14:useLocalDpi xmlns:a14="http://schemas.microsoft.com/office/drawing/2010/main" val="0"/>
+                        </a:ext>
+                      </a:extLst>
+                    </a:blip>
+                    <a:srcRect/>
+                    <a:stretch>
+                      <a:fillRect/>
+                    </a:stretch>
+                  </pic:blipFill>
+                  <pic:spPr bwMode="auto">
+                    <a:xfrm>
+                      <a:off x="0" y="0"/>
+                      <a:ext cx="5941060" cy="5789295"/>
+                    </a:xfrm>
+                    <a:prstGeom prst="rect">
+                      <a:avLst/>
+                    </a:prstGeom>
+                    <a:noFill/>
+                    <a:ln>
+                      <a:noFill/>
+                    </a:ln>
+                  </pic:spPr>
+                </pic:pic>
+              </a:graphicData>
+            </a:graphic>
+          </wp:inline>
+        </w:drawing>
+      </w:r>
+    </w:p>
+    <w:p>
+      <w:pPr>
+        <w:rPr>
+          <w:rFonts w:asciiTheme="majorHAnsi" w:eastAsiaTheme="majorEastAsia" w:hAnsiTheme="majorHAnsi" w:cstheme="majorBidi"/>
+          <w:color w:val="0F4761" w:themeColor="accent1" w:themeShade="BF"/>
+          <w:sz w:val="32"/>
+          <w:szCs w:val="32"/>
+        </w:rPr>
+      </w:pPr>
+      <w:bookmarkStart w:id="2" w:name="the-design-philosophy"/>
+      <w:bookmarkEnd w:id="1"/>
+      <w:r>
+        <w:br w:type="page"/>
+      </w:r>
+    </w:p>
     <w:p>
       <w:pPr>
         <w:pStyle w:val="Heading2"/>
       </w:pPr>
       <w:r>
-        <w:t xml:space="preserve">The Design Philosophy</w:t>
+        <w:lastRenderedPageBreak/>
+        <w:t>The Design Philosophy</w:t>
       </w:r>
     </w:p>
     <w:p>
@@ -290,7 +443,7 @@
         <w:pStyle w:val="FirstParagraph"/>
       </w:pPr>
       <w:r>
-        <w:t xml:space="preserve">Most monitoring tools (Grafana, Netdata, Prometheus) are built for ops teams managing fleets. They’re powerful but require setup, configuration, and maintenance. Research workstations are different – you want to glance at your machine’s state between experiments, not build a monitoring stack.</w:t>
+        <w:t>Most monitoring tools (Grafana, Netdata, Prometheus) are built for ops teams managing fleets. They’re powerful but require setup, configuration, and maintenance. Research workstations are different – you want to glance at your machine’s state between experiments, not build a monitoring stack.</w:t>
       </w:r>
     </w:p>
     <w:p>
@@ -298,124 +451,70 @@
         <w:pStyle w:val="BodyText"/>
       </w:pPr>
       <w:r>
-        <w:t xml:space="preserve">research-portal discovers facts about the system dynamically:</w:t>
-      </w:r>
-      <w:r>
-        <w:t xml:space="preserve"> </w:t>
-      </w:r>
-      <w:r>
-        <w:t xml:space="preserve">- CPU model and core count from</w:t>
-      </w:r>
-      <w:r>
-        <w:t xml:space="preserve"> </w:t>
+        <w:t xml:space="preserve">research-portal discovers facts about the system dynamically: - CPU model and core count from </w:t>
       </w:r>
       <w:r>
         <w:rPr>
           <w:rStyle w:val="VerbatimChar"/>
         </w:rPr>
-        <w:t xml:space="preserve">/proc/cpuinfo</w:t>
-      </w:r>
-      <w:r>
-        <w:t xml:space="preserve"> </w:t>
-      </w:r>
-      <w:r>
-        <w:t xml:space="preserve">- GPU models from</w:t>
-      </w:r>
-      <w:r>
-        <w:t xml:space="preserve"> </w:t>
+        <w:t>/proc/cpuinfo</w:t>
+      </w:r>
+      <w:r>
+        <w:t xml:space="preserve"> - GPU models from </w:t>
       </w:r>
       <w:r>
         <w:rPr>
           <w:rStyle w:val="VerbatimChar"/>
         </w:rPr>
-        <w:t xml:space="preserve">nvidia-smi</w:t>
-      </w:r>
-      <w:r>
-        <w:t xml:space="preserve">,</w:t>
-      </w:r>
-      <w:r>
-        <w:t xml:space="preserve"> </w:t>
+        <w:t>nvidia-smi</w:t>
+      </w:r>
+      <w:r>
+        <w:t xml:space="preserve">, </w:t>
       </w:r>
       <w:r>
         <w:rPr>
           <w:rStyle w:val="VerbatimChar"/>
         </w:rPr>
-        <w:t xml:space="preserve">rocm-smi</w:t>
-      </w:r>
-      <w:r>
-        <w:t xml:space="preserve">, or</w:t>
-      </w:r>
-      <w:r>
-        <w:t xml:space="preserve"> </w:t>
+        <w:t>rocm-smi</w:t>
+      </w:r>
+      <w:r>
+        <w:t xml:space="preserve">, or </w:t>
       </w:r>
       <w:r>
         <w:rPr>
           <w:rStyle w:val="VerbatimChar"/>
         </w:rPr>
-        <w:t xml:space="preserve">lspci</w:t>
-      </w:r>
-      <w:r>
-        <w:t xml:space="preserve"> </w:t>
-      </w:r>
-      <w:r>
-        <w:t xml:space="preserve">(NVIDIA, AMD, Intel)</w:t>
-      </w:r>
-      <w:r>
-        <w:t xml:space="preserve"> </w:t>
-      </w:r>
-      <w:r>
-        <w:t xml:space="preserve">- RAM from</w:t>
-      </w:r>
-      <w:r>
-        <w:t xml:space="preserve"> </w:t>
+        <w:t>lspci</w:t>
+      </w:r>
+      <w:r>
+        <w:t xml:space="preserve"> (NVIDIA, AMD, Intel) - RAM from </w:t>
       </w:r>
       <w:r>
         <w:rPr>
           <w:rStyle w:val="VerbatimChar"/>
         </w:rPr>
-        <w:t xml:space="preserve">/proc/meminfo</w:t>
-      </w:r>
-      <w:r>
-        <w:t xml:space="preserve"> </w:t>
-      </w:r>
-      <w:r>
-        <w:t xml:space="preserve">- Running pipelines from</w:t>
-      </w:r>
-      <w:r>
-        <w:t xml:space="preserve"> </w:t>
+        <w:t>/proc/meminfo</w:t>
+      </w:r>
+      <w:r>
+        <w:t xml:space="preserve"> - Running pipelines from </w:t>
       </w:r>
       <w:r>
         <w:rPr>
           <w:rStyle w:val="VerbatimChar"/>
         </w:rPr>
-        <w:t xml:space="preserve">ps</w:t>
-      </w:r>
-      <w:r>
-        <w:t xml:space="preserve"> </w:t>
-      </w:r>
-      <w:r>
-        <w:t xml:space="preserve">output with pattern matching</w:t>
-      </w:r>
-      <w:r>
-        <w:t xml:space="preserve"> </w:t>
-      </w:r>
-      <w:r>
-        <w:t xml:space="preserve">- GPU assignments from</w:t>
-      </w:r>
-      <w:r>
-        <w:t xml:space="preserve"> </w:t>
+        <w:t>ps</w:t>
+      </w:r>
+      <w:r>
+        <w:t xml:space="preserve"> output with pattern matching - GPU assignments from </w:t>
       </w:r>
       <w:r>
         <w:rPr>
           <w:rStyle w:val="VerbatimChar"/>
         </w:rPr>
-        <w:t xml:space="preserve">/proc/pid/environ</w:t>
-      </w:r>
-      <w:r>
-        <w:t xml:space="preserve"> </w:t>
-      </w:r>
-      <w:r>
-        <w:t xml:space="preserve">- Dataset names and fold progress from log file parsing</w:t>
+        <w:t>/proc/pid/environ</w:t>
+      </w:r>
+      <w:r>
+        <w:t xml:space="preserve"> - Dataset names and fold progress from log file parsing</w:t>
       </w:r>
     </w:p>
     <w:p>
@@ -423,17 +522,17 @@
         <w:pStyle w:val="BodyText"/>
       </w:pPr>
       <w:r>
-        <w:t xml:space="preserve">It adapts to whatever machine it lands on. Dual Xeons with two Quadro GV100s? Single Ryzen with an RTX 4090? A headless server with no GPU at all? Same command, different dashboard.</w:t>
-      </w:r>
-    </w:p>
-    <w:bookmarkEnd w:id="10"/>
-    <w:bookmarkStart w:id="11" w:name="Xabc28ec520ce7f7b0620978473acb85c3565eeb"/>
+        <w:t>It adapts to whatever machine it lands on. Dual Xeons with two Quadro GV100s? Single Ryzen with an RTX 4090? A headless server with no GPU at all? Same command, different dashboard.</w:t>
+      </w:r>
+    </w:p>
     <w:p>
       <w:pPr>
         <w:pStyle w:val="Heading2"/>
       </w:pPr>
-      <w:r>
-        <w:t xml:space="preserve">Pipeline Discovery: The Part I’m Most Proud Of</w:t>
+      <w:bookmarkStart w:id="3" w:name="Xabc28ec520ce7f7b0620978473acb85c3565eeb"/>
+      <w:bookmarkEnd w:id="2"/>
+      <w:r>
+        <w:t>Pipeline Discovery: The Part I’m Most Proud Of</w:t>
       </w:r>
     </w:p>
     <w:p>
@@ -441,7 +540,7 @@
         <w:pStyle w:val="FirstParagraph"/>
       </w:pPr>
       <w:r>
-        <w:t xml:space="preserve">The dashboard and resource map are nice, but the pipeline flow is where research-portal earns its keep.</w:t>
+        <w:t>The dashboard and resource map are nice, but the pipeline flow is where research-portal earns its keep.</w:t>
       </w:r>
     </w:p>
     <w:p>
@@ -449,7 +548,7 @@
         <w:pStyle w:val="BodyText"/>
       </w:pPr>
       <w:r>
-        <w:t xml:space="preserve">It follows a few conventions to make your pipelines maximally visible:</w:t>
+        <w:t>It follows a few conventions to make your pipelines maximally visible:</w:t>
       </w:r>
     </w:p>
     <w:p>
@@ -461,7 +560,7 @@
           <w:b/>
           <w:bCs/>
         </w:rPr>
-        <w:t xml:space="preserve">Name your scripts descriptively.</w:t>
+        <w:t>Name your scripts descriptively.</w:t>
       </w:r>
       <w:r>
         <w:t xml:space="preserve"> </w:t>
@@ -470,52 +569,19 @@
         <w:rPr>
           <w:rStyle w:val="VerbatimChar"/>
         </w:rPr>
-        <w:t xml:space="preserve">python train_resnet.py</w:t>
-      </w:r>
-      <w:r>
-        <w:t xml:space="preserve"> </w:t>
-      </w:r>
-      <w:r>
-        <w:t xml:space="preserve">shows as</w:t>
-      </w:r>
-      <w:r>
-        <w:t xml:space="preserve"> </w:t>
-      </w:r>
-      <w:r>
-        <w:t xml:space="preserve">“train_resnet”</w:t>
-      </w:r>
-      <w:r>
-        <w:t xml:space="preserve"> </w:t>
-      </w:r>
-      <w:r>
-        <w:t xml:space="preserve">in the portal.</w:t>
-      </w:r>
-      <w:r>
-        <w:t xml:space="preserve"> </w:t>
+        <w:t>python train_resnet.py</w:t>
+      </w:r>
+      <w:r>
+        <w:t xml:space="preserve"> shows as “train_resnet” in the portal. </w:t>
       </w:r>
       <w:r>
         <w:rPr>
           <w:rStyle w:val="VerbatimChar"/>
         </w:rPr>
-        <w:t xml:space="preserve">python run.py</w:t>
-      </w:r>
-      <w:r>
-        <w:t xml:space="preserve"> </w:t>
-      </w:r>
-      <w:r>
-        <w:t xml:space="preserve">shows as</w:t>
-      </w:r>
-      <w:r>
-        <w:t xml:space="preserve"> </w:t>
-      </w:r>
-      <w:r>
-        <w:t xml:space="preserve">“run”</w:t>
-      </w:r>
-      <w:r>
-        <w:t xml:space="preserve"> </w:t>
-      </w:r>
-      <w:r>
-        <w:t xml:space="preserve">– not helpful.</w:t>
+        <w:t>python run.py</w:t>
+      </w:r>
+      <w:r>
+        <w:t xml:space="preserve"> shows as “run” – not helpful.</w:t>
       </w:r>
     </w:p>
     <w:p>
@@ -527,7 +593,7 @@
           <w:b/>
           <w:bCs/>
         </w:rPr>
-        <w:t xml:space="preserve">One process per job.</w:t>
+        <w:t>One process per job.</w:t>
       </w:r>
       <w:r>
         <w:t xml:space="preserve"> </w:t>
@@ -536,25 +602,10 @@
         <w:rPr>
           <w:rStyle w:val="VerbatimChar"/>
         </w:rPr>
-        <w:t xml:space="preserve">python experiment.py EEG 0</w:t>
-      </w:r>
-      <w:r>
-        <w:t xml:space="preserve"> </w:t>
-      </w:r>
-      <w:r>
-        <w:t xml:space="preserve">shows as</w:t>
-      </w:r>
-      <w:r>
-        <w:t xml:space="preserve"> </w:t>
-      </w:r>
-      <w:r>
-        <w:t xml:space="preserve">“experiment/EEG”</w:t>
-      </w:r>
-      <w:r>
-        <w:t xml:space="preserve"> </w:t>
-      </w:r>
-      <w:r>
-        <w:t xml:space="preserve">with GPU 0 tagged. The first positional argument becomes the pipeline sub-name.</w:t>
+        <w:t>python experiment.py EEG 0</w:t>
+      </w:r>
+      <w:r>
+        <w:t xml:space="preserve"> shows as “experiment/EEG” with GPU 0 tagged. The first positional argument becomes the pipeline sub-name.</w:t>
       </w:r>
     </w:p>
     <w:p>
@@ -566,13 +617,10 @@
           <w:b/>
           <w:bCs/>
         </w:rPr>
-        <w:t xml:space="preserve">Log to /tmp with tee.</w:t>
-      </w:r>
-      <w:r>
-        <w:t xml:space="preserve"> </w:t>
-      </w:r>
-      <w:r>
-        <w:t xml:space="preserve">The portal scans for log files and parses them for progress:</w:t>
+        <w:t>Log to /tmp with tee.</w:t>
+      </w:r>
+      <w:r>
+        <w:t xml:space="preserve"> The portal scans for log files and parses them for progress:</w:t>
       </w:r>
     </w:p>
     <w:p>
@@ -583,7 +631,7 @@
         <w:rPr>
           <w:rStyle w:val="CommentTok"/>
         </w:rPr>
-        <w:t xml:space="preserve"># Portal recognizes these patterns:</w:t>
+        <w:t># Portal recognizes these patterns:</w:t>
       </w:r>
       <w:r>
         <w:br/>
@@ -592,7 +640,7 @@
         <w:rPr>
           <w:rStyle w:val="NormalTok"/>
         </w:rPr>
-        <w:t xml:space="preserve">log.info(</w:t>
+        <w:t>log.info(</w:t>
       </w:r>
       <w:r>
         <w:rPr>
@@ -604,19 +652,19 @@
         <w:rPr>
           <w:rStyle w:val="SpecialCharTok"/>
         </w:rPr>
-        <w:t xml:space="preserve">%s</w:t>
+        <w:t>%s</w:t>
       </w:r>
       <w:r>
         <w:rPr>
           <w:rStyle w:val="StringTok"/>
         </w:rPr>
-        <w:t xml:space="preserve">: N=</w:t>
+        <w:t>: N=</w:t>
       </w:r>
       <w:r>
         <w:rPr>
           <w:rStyle w:val="SpecialCharTok"/>
         </w:rPr>
-        <w:t xml:space="preserve">%d</w:t>
+        <w:t>%d</w:t>
       </w:r>
       <w:r>
         <w:rPr>
@@ -628,7 +676,7 @@
         <w:rPr>
           <w:rStyle w:val="SpecialCharTok"/>
         </w:rPr>
-        <w:t xml:space="preserve">%d</w:t>
+        <w:t>%d</w:t>
       </w:r>
       <w:r>
         <w:rPr>
@@ -646,7 +694,7 @@
         <w:rPr>
           <w:rStyle w:val="CommentTok"/>
         </w:rPr>
-        <w:t xml:space="preserve"># dataset identification</w:t>
+        <w:t># dataset identification</w:t>
       </w:r>
       <w:r>
         <w:br/>
@@ -655,7 +703,7 @@
         <w:rPr>
           <w:rStyle w:val="NormalTok"/>
         </w:rPr>
-        <w:t xml:space="preserve">log.info(</w:t>
+        <w:t>log.info(</w:t>
       </w:r>
       <w:r>
         <w:rPr>
@@ -667,37 +715,37 @@
         <w:rPr>
           <w:rStyle w:val="SpecialCharTok"/>
         </w:rPr>
-        <w:t xml:space="preserve">%d</w:t>
+        <w:t>%d</w:t>
       </w:r>
       <w:r>
         <w:rPr>
           <w:rStyle w:val="StringTok"/>
         </w:rPr>
-        <w:t xml:space="preserve">/</w:t>
+        <w:t>/</w:t>
       </w:r>
       <w:r>
         <w:rPr>
           <w:rStyle w:val="SpecialCharTok"/>
         </w:rPr>
-        <w:t xml:space="preserve">%d</w:t>
+        <w:t>%d</w:t>
       </w:r>
       <w:r>
         <w:rPr>
           <w:rStyle w:val="StringTok"/>
         </w:rPr>
-        <w:t xml:space="preserve">: accuracy=</w:t>
+        <w:t>: accuracy=</w:t>
       </w:r>
       <w:r>
         <w:rPr>
           <w:rStyle w:val="SpecialCharTok"/>
         </w:rPr>
-        <w:t xml:space="preserve">%.4f</w:t>
+        <w:t>%.4f</w:t>
       </w:r>
       <w:r>
         <w:rPr>
           <w:rStyle w:val="StringTok"/>
         </w:rPr>
-        <w:t xml:space="preserve">"</w:t>
+        <w:t>"</w:t>
       </w:r>
       <w:r>
         <w:rPr>
@@ -709,7 +757,7 @@
         <w:rPr>
           <w:rStyle w:val="CommentTok"/>
         </w:rPr>
-        <w:t xml:space="preserve"># progress</w:t>
+        <w:t># progress</w:t>
       </w:r>
       <w:r>
         <w:br/>
@@ -718,7 +766,7 @@
         <w:rPr>
           <w:rStyle w:val="NormalTok"/>
         </w:rPr>
-        <w:t xml:space="preserve">log.info(</w:t>
+        <w:t>log.info(</w:t>
       </w:r>
       <w:r>
         <w:rPr>
@@ -730,25 +778,25 @@
         <w:rPr>
           <w:rStyle w:val="SpecialCharTok"/>
         </w:rPr>
-        <w:t xml:space="preserve">%s</w:t>
+        <w:t>%s</w:t>
       </w:r>
       <w:r>
         <w:rPr>
           <w:rStyle w:val="StringTok"/>
         </w:rPr>
-        <w:t xml:space="preserve">: accuracy=</w:t>
+        <w:t>: accuracy=</w:t>
       </w:r>
       <w:r>
         <w:rPr>
           <w:rStyle w:val="SpecialCharTok"/>
         </w:rPr>
-        <w:t xml:space="preserve">%.4f</w:t>
+        <w:t>%.4f</w:t>
       </w:r>
       <w:r>
         <w:rPr>
           <w:rStyle w:val="StringTok"/>
         </w:rPr>
-        <w:t xml:space="preserve">"</w:t>
+        <w:t>"</w:t>
       </w:r>
       <w:r>
         <w:rPr>
@@ -760,7 +808,7 @@
         <w:rPr>
           <w:rStyle w:val="CommentTok"/>
         </w:rPr>
-        <w:t xml:space="preserve"># completion</w:t>
+        <w:t># completion</w:t>
       </w:r>
     </w:p>
     <w:p>
@@ -772,38 +820,29 @@
           <w:b/>
           <w:bCs/>
         </w:rPr>
-        <w:t xml:space="preserve">Results files.</w:t>
-      </w:r>
-      <w:r>
-        <w:t xml:space="preserve"> </w:t>
-      </w:r>
-      <w:r>
-        <w:t xml:space="preserve">Drop</w:t>
-      </w:r>
-      <w:r>
-        <w:t xml:space="preserve"> </w:t>
+        <w:t>Results files.</w:t>
+      </w:r>
+      <w:r>
+        <w:t xml:space="preserve"> Drop </w:t>
       </w:r>
       <w:r>
         <w:rPr>
           <w:rStyle w:val="VerbatimChar"/>
         </w:rPr>
-        <w:t xml:space="preserve">result_dataset.json</w:t>
-      </w:r>
-      <w:r>
-        <w:t xml:space="preserve"> </w:t>
-      </w:r>
-      <w:r>
-        <w:t xml:space="preserve">files and completed experiments show up in the flow with F1 scores and outcomes, even after the process exits.</w:t>
-      </w:r>
-    </w:p>
-    <w:bookmarkEnd w:id="11"/>
-    <w:bookmarkStart w:id="12" w:name="security"/>
+        <w:t>result_dataset.json</w:t>
+      </w:r>
+      <w:r>
+        <w:t xml:space="preserve"> files and completed experiments show up in the flow with F1 scores and outcomes, even after the process exits.</w:t>
+      </w:r>
+    </w:p>
     <w:p>
       <w:pPr>
         <w:pStyle w:val="Heading2"/>
       </w:pPr>
-      <w:r>
-        <w:t xml:space="preserve">Security</w:t>
+      <w:bookmarkStart w:id="4" w:name="security"/>
+      <w:bookmarkEnd w:id="3"/>
+      <w:r>
+        <w:t>Security</w:t>
       </w:r>
     </w:p>
     <w:p>
@@ -811,47 +850,18 @@
         <w:pStyle w:val="FirstParagraph"/>
       </w:pPr>
       <w:r>
-        <w:t xml:space="preserve">Since research machines sometimes have public IPs or are on shared networks:</w:t>
-      </w:r>
-      <w:r>
-        <w:t xml:space="preserve"> </w:t>
-      </w:r>
-      <w:r>
-        <w:t xml:space="preserve">- HTTP Basic authentication (override user/pass via CLI or env vars)</w:t>
-      </w:r>
-      <w:r>
-        <w:t xml:space="preserve"> </w:t>
-      </w:r>
-      <w:r>
-        <w:t xml:space="preserve">- Multi-user support: admin (full access) and guest accounts (read-only)</w:t>
-      </w:r>
-      <w:r>
-        <w:t xml:space="preserve"> </w:t>
-      </w:r>
-      <w:r>
-        <w:t xml:space="preserve">- Auto-detects SSL certificates for HTTPS</w:t>
-      </w:r>
-      <w:r>
-        <w:t xml:space="preserve"> </w:t>
-      </w:r>
-      <w:r>
-        <w:t xml:space="preserve">- Security headers (CSP, X-Frame-Options, X-Content-Type-Options)</w:t>
-      </w:r>
-      <w:r>
-        <w:t xml:space="preserve"> </w:t>
-      </w:r>
-      <w:r>
-        <w:t xml:space="preserve">- No config files with credentials – everything via environment</w:t>
-      </w:r>
-    </w:p>
-    <w:bookmarkEnd w:id="12"/>
-    <w:bookmarkStart w:id="13" w:name="the-stack"/>
+        <w:t>Since research machines sometimes have public IPs or are on shared networks: - HTTP Basic authentication (override user/pass via CLI or env vars) - Multi-user support: admin (full access) and guest accounts (read-only) - Auto-detects SSL certificates for HTTPS - Security headers (CSP, X-Frame-Options, X-Content-Type-Options) - No config files with credentials – everything via environment</w:t>
+      </w:r>
+    </w:p>
     <w:p>
       <w:pPr>
         <w:pStyle w:val="Heading2"/>
       </w:pPr>
-      <w:r>
-        <w:t xml:space="preserve">The Stack</w:t>
+      <w:bookmarkStart w:id="5" w:name="the-stack"/>
+      <w:bookmarkEnd w:id="4"/>
+      <w:r>
+        <w:lastRenderedPageBreak/>
+        <w:t>The Stack</w:t>
       </w:r>
     </w:p>
     <w:p>
@@ -859,88 +869,46 @@
         <w:pStyle w:val="FirstParagraph"/>
       </w:pPr>
       <w:r>
-        <w:t xml:space="preserve">Deliberately minimal:</w:t>
-      </w:r>
-      <w:r>
-        <w:t xml:space="preserve"> </w:t>
-      </w:r>
-      <w:r>
-        <w:t xml:space="preserve">-</w:t>
-      </w:r>
-      <w:r>
-        <w:t xml:space="preserve"> </w:t>
+        <w:t xml:space="preserve">Deliberately minimal: - </w:t>
       </w:r>
       <w:r>
         <w:rPr>
           <w:b/>
           <w:bCs/>
         </w:rPr>
-        <w:t xml:space="preserve">Flask</w:t>
-      </w:r>
-      <w:r>
-        <w:t xml:space="preserve"> </w:t>
-      </w:r>
-      <w:r>
-        <w:t xml:space="preserve">(single dependency)</w:t>
-      </w:r>
-      <w:r>
-        <w:t xml:space="preserve"> </w:t>
-      </w:r>
-      <w:r>
-        <w:t xml:space="preserve">-</w:t>
-      </w:r>
-      <w:r>
-        <w:t xml:space="preserve"> </w:t>
+        <w:t>Flask</w:t>
+      </w:r>
+      <w:r>
+        <w:t xml:space="preserve"> (single dependency) - </w:t>
       </w:r>
       <w:r>
         <w:rPr>
           <w:b/>
           <w:bCs/>
         </w:rPr>
-        <w:t xml:space="preserve">Vanilla JS</w:t>
-      </w:r>
-      <w:r>
-        <w:t xml:space="preserve"> </w:t>
-      </w:r>
-      <w:r>
-        <w:t xml:space="preserve">(no React, no npm, no build step)</w:t>
-      </w:r>
-      <w:r>
-        <w:t xml:space="preserve"> </w:t>
-      </w:r>
-      <w:r>
-        <w:t xml:space="preserve">- Templates are inline – the entire app is</w:t>
-      </w:r>
-      <w:r>
-        <w:t xml:space="preserve"> </w:t>
+        <w:t>Vanilla JS</w:t>
+      </w:r>
+      <w:r>
+        <w:t xml:space="preserve"> (no React, no npm, no build step) - Templates are inline – the entire app is </w:t>
       </w:r>
       <w:r>
         <w:rPr>
           <w:rStyle w:val="VerbatimChar"/>
         </w:rPr>
-        <w:t xml:space="preserve">pip install</w:t>
-      </w:r>
-      <w:r>
-        <w:t xml:space="preserve"> </w:t>
-      </w:r>
-      <w:r>
-        <w:t xml:space="preserve">and go</w:t>
-      </w:r>
-      <w:r>
-        <w:t xml:space="preserve"> </w:t>
-      </w:r>
-      <w:r>
-        <w:t xml:space="preserve">- Hatchling build, CI with ruff lint + pytest on Python 3.10/3.11/3.12</w:t>
-      </w:r>
-    </w:p>
-    <w:bookmarkEnd w:id="13"/>
-    <w:bookmarkStart w:id="14" w:name="where-it-came-from"/>
+        <w:t>pip install</w:t>
+      </w:r>
+      <w:r>
+        <w:t xml:space="preserve"> and go - Hatchling build, CI with ruff lint + pytest on Python 3.10/3.11/3.12</w:t>
+      </w:r>
+    </w:p>
     <w:p>
       <w:pPr>
         <w:pStyle w:val="Heading2"/>
       </w:pPr>
-      <w:r>
-        <w:t xml:space="preserve">Where It Came From</w:t>
+      <w:bookmarkStart w:id="6" w:name="where-it-came-from"/>
+      <w:bookmarkEnd w:id="5"/>
+      <w:r>
+        <w:t>Where It Came From</w:t>
       </w:r>
     </w:p>
     <w:p>
@@ -948,7 +916,7 @@
         <w:pStyle w:val="FirstParagraph"/>
       </w:pPr>
       <w:r>
-        <w:t xml:space="preserve">I built this while running a 19-dataset benchmark for a symbolic AI project (Theory Radar). I had two GPUs running different experiments, 14 CPU-heavy gradient boosting baselines, and I kept losing track of what was running where. The portal started as a quick Flask script and evolved into something I thought others might find useful.</w:t>
+        <w:t>I built this while running a 19-dataset benchmark for a symbolic AI project (Theory Radar). I had two GPUs running different experiments, 14 CPU-heavy gradient boosting baselines, and I kept losing track of what was running where. The portal started as a quick Flask script and evolved into something I thought others might find useful.</w:t>
       </w:r>
     </w:p>
     <w:p>
@@ -956,17 +924,17 @@
         <w:pStyle w:val="BodyText"/>
       </w:pPr>
       <w:r>
-        <w:t xml:space="preserve">The irony: I built a monitoring tool because I needed to monitor experiments, and now the monitoring tool is one of the experiments the portal monitors.</w:t>
-      </w:r>
-    </w:p>
-    <w:bookmarkEnd w:id="14"/>
-    <w:bookmarkStart w:id="15" w:name="open-source"/>
+        <w:t>The irony: I built a monitoring tool because I needed to monitor experiments, and now the monitoring tool is one of the experiments the portal monitors.</w:t>
+      </w:r>
+    </w:p>
     <w:p>
       <w:pPr>
         <w:pStyle w:val="Heading2"/>
       </w:pPr>
-      <w:r>
-        <w:t xml:space="preserve">Open Source</w:t>
+      <w:bookmarkStart w:id="7" w:name="open-source"/>
+      <w:bookmarkEnd w:id="6"/>
+      <w:r>
+        <w:t>Open Source</w:t>
       </w:r>
     </w:p>
     <w:p>
@@ -974,7 +942,7 @@
         <w:pStyle w:val="FirstParagraph"/>
       </w:pPr>
       <w:r>
-        <w:t xml:space="preserve">The code is on GitHub with CI badges, tests, and MIT license:</w:t>
+        <w:t>The code is on GitHub with CI badges, tests, and MIT license:</w:t>
       </w:r>
     </w:p>
     <w:p>
@@ -982,7 +950,7 @@
         <w:pStyle w:val="Compact"/>
         <w:numPr>
           <w:ilvl w:val="0"/>
-          <w:numId w:val="1002"/>
+          <w:numId w:val="3"/>
         </w:numPr>
       </w:pPr>
       <w:r>
@@ -990,13 +958,10 @@
           <w:b/>
           <w:bCs/>
         </w:rPr>
-        <w:t xml:space="preserve">PyPI:</w:t>
-      </w:r>
-      <w:r>
-        <w:t xml:space="preserve"> </w:t>
-      </w:r>
-      <w:r>
-        <w:t xml:space="preserve">https://pypi.org/project/research-portal/</w:t>
+        <w:t>PyPI:</w:t>
+      </w:r>
+      <w:r>
+        <w:t xml:space="preserve"> https://pypi.org/project/research-portal/</w:t>
       </w:r>
     </w:p>
     <w:p>
@@ -1004,7 +969,7 @@
         <w:pStyle w:val="Compact"/>
         <w:numPr>
           <w:ilvl w:val="0"/>
-          <w:numId w:val="1002"/>
+          <w:numId w:val="3"/>
         </w:numPr>
       </w:pPr>
       <w:r>
@@ -1012,13 +977,10 @@
           <w:b/>
           <w:bCs/>
         </w:rPr>
-        <w:t xml:space="preserve">GitHub:</w:t>
-      </w:r>
-      <w:r>
-        <w:t xml:space="preserve"> </w:t>
-      </w:r>
-      <w:r>
-        <w:t xml:space="preserve">https://github.com/ahb-sjsu/atlas-portal</w:t>
+        <w:t>GitHub:</w:t>
+      </w:r>
+      <w:r>
+        <w:t xml:space="preserve"> https://github.com/ahb-sjsu/atlas-portal</w:t>
       </w:r>
     </w:p>
     <w:p>
@@ -1026,28 +988,22 @@
         <w:pStyle w:val="FirstParagraph"/>
       </w:pPr>
       <w:r>
-        <w:t xml:space="preserve">If you run ML workloads on Linux, give it a try.</w:t>
-      </w:r>
-      <w:r>
-        <w:t xml:space="preserve"> </w:t>
+        <w:t xml:space="preserve">If you run ML workloads on Linux, give it a try. </w:t>
       </w:r>
       <w:r>
         <w:rPr>
           <w:rStyle w:val="VerbatimChar"/>
         </w:rPr>
-        <w:t xml:space="preserve">pip install research-portal &amp;&amp; research-portal</w:t>
-      </w:r>
-      <w:r>
-        <w:t xml:space="preserve"> </w:t>
-      </w:r>
-      <w:r>
-        <w:t xml:space="preserve">– 30 seconds to a live dashboard.</w:t>
-      </w:r>
-    </w:p>
-    <w:p>
-      <w:r>
-        <w:pict>
-          <v:rect style="width:0;height:1.5pt" o:hralign="center" o:hrstd="t" o:hr="t"/>
+        <w:t>pip install research-portal &amp;&amp; research-portal</w:t>
+      </w:r>
+      <w:r>
+        <w:t xml:space="preserve"> – 30 seconds to a live dashboard.</w:t>
+      </w:r>
+    </w:p>
+    <w:p>
+      <w:r>
+        <w:pict w14:anchorId="66761914">
+          <v:rect id="_x0000_i1025" style="width:0;height:1.5pt" o:hralign="center" o:hrstd="t" o:hr="t"/>
         </w:pict>
       </w:r>
     </w:p>
@@ -1056,48 +1012,29 @@
         <w:pStyle w:val="FirstParagraph"/>
       </w:pPr>
       <w:r>
-        <w:t xml:space="preserve">#MachineLearning #Python #OpenSource #DevTools #GPU #MLOps #Research #Monitoring</w:t>
-      </w:r>
-    </w:p>
-    <w:bookmarkEnd w:id="15"/>
-    <w:bookmarkEnd w:id="16"/>
+        <w:t>#MachineLearning #Python #OpenSource #DevTools #GPU #MLOps #Research #Monitoring</w:t>
+      </w:r>
+      <w:bookmarkEnd w:id="0"/>
+      <w:bookmarkEnd w:id="7"/>
+    </w:p>
     <w:sectPr>
       <w:footnotePr>
         <w:numRestart w:val="eachSect"/>
       </w:footnotePr>
+      <w:pgSz w:w="12240" w:h="15840"/>
+      <w:pgMar w:top="1440" w:right="1440" w:bottom="1440" w:left="1440" w:header="720" w:footer="720" w:gutter="0"/>
+      <w:cols w:space="720"/>
     </w:sectPr>
   </w:body>
 </w:document>
 </file>
 
-<file path=word/comments.xml><?xml version="1.0" encoding="utf-8"?>
-<w:comments xmlns:w="http://schemas.openxmlformats.org/wordprocessingml/2006/main" xmlns:m="http://schemas.openxmlformats.org/officeDocument/2006/math" xmlns:r="http://schemas.openxmlformats.org/officeDocument/2006/relationships" xmlns:o="urn:schemas-microsoft-com:office:office" xmlns:v="urn:schemas-microsoft-com:vml" xmlns:w10="urn:schemas-microsoft-com:office:word" xmlns:a="http://schemas.openxmlformats.org/drawingml/2006/main" xmlns:pic="http://schemas.openxmlformats.org/drawingml/2006/picture" xmlns:wp="http://schemas.openxmlformats.org/drawingml/2006/wordprocessingDrawing"/>
-</file>
-
-<file path=word/footnotes.xml><?xml version="1.0" encoding="utf-8"?>
-<w:footnotes xmlns:w="http://schemas.openxmlformats.org/wordprocessingml/2006/main" xmlns:m="http://schemas.openxmlformats.org/officeDocument/2006/math" xmlns:r="http://schemas.openxmlformats.org/officeDocument/2006/relationships" xmlns:o="urn:schemas-microsoft-com:office:office" xmlns:v="urn:schemas-microsoft-com:vml" xmlns:w10="urn:schemas-microsoft-com:office:word" xmlns:a="http://schemas.openxmlformats.org/drawingml/2006/main" xmlns:pic="http://schemas.openxmlformats.org/drawingml/2006/picture" xmlns:wp="http://schemas.openxmlformats.org/drawingml/2006/wordprocessingDrawing">
-  <w:footnote w:type="continuationSeparator" w:id="0">
-    <w:p>
-      <w:r>
-        <w:continuationSeparator/>
-      </w:r>
-    </w:p>
-  </w:footnote>
-  <w:footnote w:type="separator" w:id="-1">
-    <w:p>
-      <w:r>
-        <w:separator/>
-      </w:r>
-    </w:p>
-  </w:footnote>
-</w:footnotes>
-</file>
-
 <file path=word/numbering.xml><?xml version="1.0" encoding="utf-8"?>
-<w:numbering xmlns:w="http://schemas.openxmlformats.org/wordprocessingml/2006/main">
-  <w:abstractNum w:abstractNumId="990">
+<w:numbering xmlns:wpc="http://schemas.microsoft.com/office/word/2010/wordprocessingCanvas" xmlns:cx="http://schemas.microsoft.com/office/drawing/2014/chartex" xmlns:cx1="http://schemas.microsoft.com/office/drawing/2015/9/8/chartex" xmlns:cx2="http://schemas.microsoft.com/office/drawing/2015/10/21/chartex" xmlns:cx3="http://schemas.microsoft.com/office/drawing/2016/5/9/chartex" xmlns:cx4="http://schemas.microsoft.com/office/drawing/2016/5/10/chartex" xmlns:cx5="http://schemas.microsoft.com/office/drawing/2016/5/11/chartex" xmlns:cx6="http://schemas.microsoft.com/office/drawing/2016/5/12/chartex" xmlns:cx7="http://schemas.microsoft.com/office/drawing/2016/5/13/chartex" xmlns:cx8="http://schemas.microsoft.com/office/drawing/2016/5/14/chartex" xmlns:mc="http://schemas.openxmlformats.org/markup-compatibility/2006" xmlns:aink="http://schemas.microsoft.com/office/drawing/2016/ink" xmlns:am3d="http://schemas.microsoft.com/office/drawing/2017/model3d" xmlns:o="urn:schemas-microsoft-com:office:office" xmlns:oel="http://schemas.microsoft.com/office/2019/extlst" xmlns:r="http://schemas.openxmlformats.org/officeDocument/2006/relationships" xmlns:m="http://schemas.openxmlformats.org/officeDocument/2006/math" xmlns:v="urn:schemas-microsoft-com:vml" xmlns:wp14="http://schemas.microsoft.com/office/word/2010/wordprocessingDrawing" xmlns:wp="http://schemas.openxmlformats.org/drawingml/2006/wordprocessingDrawing" xmlns:w10="urn:schemas-microsoft-com:office:word" xmlns:w="http://schemas.openxmlformats.org/wordprocessingml/2006/main" xmlns:w14="http://schemas.microsoft.com/office/word/2010/wordml" xmlns:w15="http://schemas.microsoft.com/office/word/2012/wordml" xmlns:w16cex="http://schemas.microsoft.com/office/word/2018/wordml/cex" xmlns:w16cid="http://schemas.microsoft.com/office/word/2016/wordml/cid" xmlns:w16="http://schemas.microsoft.com/office/word/2018/wordml" xmlns:w16du="http://schemas.microsoft.com/office/word/2023/wordml/word16du" xmlns:w16sdtdh="http://schemas.microsoft.com/office/word/2020/wordml/sdtdatahash" xmlns:w16sdtfl="http://schemas.microsoft.com/office/word/2024/wordml/sdtformatlock" xmlns:w16se="http://schemas.microsoft.com/office/word/2015/wordml/symex" xmlns:wpg="http://schemas.microsoft.com/office/word/2010/wordprocessingGroup" xmlns:wpi="http://schemas.microsoft.com/office/word/2010/wordprocessingInk" xmlns:wne="http://schemas.microsoft.com/office/word/2006/wordml" xmlns:wps="http://schemas.microsoft.com/office/word/2010/wordprocessingShape" mc:Ignorable="w14 w15 w16se w16cid w16 w16cex w16sdtdh w16sdtfl w16du wp14">
+  <w:abstractNum w:abstractNumId="0" w15:restartNumberingAfterBreak="0">
     <w:nsid w:val="0000A990"/>
     <w:multiLevelType w:val="multilevel"/>
+    <w:tmpl w:val="2ADC9206"/>
     <w:lvl w:ilvl="0">
       <w:numFmt w:val="bullet"/>
       <w:lvlText w:val=" "/>
@@ -1171,9 +1108,10 @@
       </w:pPr>
     </w:lvl>
   </w:abstractNum>
-  <w:abstractNum w:abstractNumId="991">
+  <w:abstractNum w:abstractNumId="1" w15:restartNumberingAfterBreak="0">
     <w:nsid w:val="0000A991"/>
     <w:multiLevelType w:val="multilevel"/>
+    <w:tmpl w:val="86EEBDA4"/>
     <w:lvl w:ilvl="0">
       <w:numFmt w:val="bullet"/>
       <w:lvlText w:val=""/>
@@ -1274,27 +1212,27 @@
       </w:rPr>
     </w:lvl>
   </w:abstractNum>
-  <w:num w:numId="1000">
-    <w:abstractNumId w:val="990"/>
+  <w:num w:numId="1" w16cid:durableId="232353218">
+    <w:abstractNumId w:val="0"/>
   </w:num>
-  <w:num w:numId="1001">
-    <w:abstractNumId w:val="991"/>
+  <w:num w:numId="2" w16cid:durableId="84156140">
+    <w:abstractNumId w:val="1"/>
   </w:num>
-  <w:num w:numId="1002">
-    <w:abstractNumId w:val="991"/>
+  <w:num w:numId="3" w16cid:durableId="1385064060">
+    <w:abstractNumId w:val="1"/>
   </w:num>
 </w:numbering>
 </file>
 
 <file path=word/styles.xml><?xml version="1.0" encoding="utf-8"?>
-<w:styles xmlns:r="http://schemas.openxmlformats.org/officeDocument/2006/relationships" xmlns:w="http://schemas.openxmlformats.org/wordprocessingml/2006/main">
+<w:styles xmlns:mc="http://schemas.openxmlformats.org/markup-compatibility/2006" xmlns:r="http://schemas.openxmlformats.org/officeDocument/2006/relationships" xmlns:w="http://schemas.openxmlformats.org/wordprocessingml/2006/main" xmlns:w14="http://schemas.microsoft.com/office/word/2010/wordml" xmlns:w15="http://schemas.microsoft.com/office/word/2012/wordml" xmlns:w16cex="http://schemas.microsoft.com/office/word/2018/wordml/cex" xmlns:w16cid="http://schemas.microsoft.com/office/word/2016/wordml/cid" xmlns:w16="http://schemas.microsoft.com/office/word/2018/wordml" xmlns:w16du="http://schemas.microsoft.com/office/word/2023/wordml/word16du" xmlns:w16sdtdh="http://schemas.microsoft.com/office/word/2020/wordml/sdtdatahash" xmlns:w16sdtfl="http://schemas.microsoft.com/office/word/2024/wordml/sdtformatlock" xmlns:w16se="http://schemas.microsoft.com/office/word/2015/wordml/symex" mc:Ignorable="w14 w15 w16se w16cid w16 w16cex w16sdtdh w16sdtfl w16du">
   <w:docDefaults>
     <w:rPrDefault>
       <w:rPr>
-        <w:rFonts w:asciiTheme="minorHAnsi" w:cstheme="minorBidi" w:eastAsiaTheme="minorEastAsia" w:hAnsiTheme="minorHAnsi"/>
+        <w:rFonts w:asciiTheme="minorHAnsi" w:eastAsiaTheme="minorEastAsia" w:hAnsiTheme="minorHAnsi" w:cstheme="minorBidi"/>
         <w:sz w:val="24"/>
         <w:szCs w:val="24"/>
-        <w:lang w:bidi="ar-SA" w:eastAsia="zh-CN" w:val="en-US"/>
+        <w:lang w:val="en-US" w:eastAsia="zh-CN" w:bidi="ar-SA"/>
       </w:rPr>
     </w:rPrDefault>
     <w:pPrDefault>
@@ -1303,168 +1241,255 @@
       </w:pPr>
     </w:pPrDefault>
   </w:docDefaults>
-  <w:latentStyles w:count="276" w:defLockedState="0" w:defQFormat="0" w:defSemiHidden="0" w:defUIPriority="0" w:defUnhideWhenUsed="0"/>
-  <w:style w:default="1" w:styleId="Normal" w:type="paragraph">
+  <w:latentStyles w:defLockedState="0" w:defUIPriority="0" w:defSemiHidden="0" w:defUnhideWhenUsed="0" w:defQFormat="0" w:count="376">
+    <w:lsdException w:name="Normal Table" w:semiHidden="1" w:unhideWhenUsed="1"/>
+    <w:lsdException w:name="Table Simple 1" w:semiHidden="1" w:unhideWhenUsed="1"/>
+    <w:lsdException w:name="Table Simple 2" w:semiHidden="1" w:unhideWhenUsed="1"/>
+    <w:lsdException w:name="Table Simple 3" w:semiHidden="1" w:unhideWhenUsed="1"/>
+    <w:lsdException w:name="Table Classic 1" w:semiHidden="1" w:unhideWhenUsed="1"/>
+    <w:lsdException w:name="Table Classic 2" w:semiHidden="1" w:unhideWhenUsed="1"/>
+    <w:lsdException w:name="Table Classic 3" w:semiHidden="1" w:unhideWhenUsed="1"/>
+    <w:lsdException w:name="Table Classic 4" w:semiHidden="1" w:unhideWhenUsed="1"/>
+    <w:lsdException w:name="Table Colorful 1" w:semiHidden="1" w:unhideWhenUsed="1"/>
+    <w:lsdException w:name="Table Colorful 2" w:semiHidden="1" w:unhideWhenUsed="1"/>
+    <w:lsdException w:name="Table Colorful 3" w:semiHidden="1" w:unhideWhenUsed="1"/>
+    <w:lsdException w:name="Table Columns 1" w:semiHidden="1" w:unhideWhenUsed="1"/>
+    <w:lsdException w:name="Table Columns 2" w:semiHidden="1" w:unhideWhenUsed="1"/>
+    <w:lsdException w:name="Table Columns 3" w:semiHidden="1" w:unhideWhenUsed="1"/>
+    <w:lsdException w:name="Table Columns 4" w:semiHidden="1" w:unhideWhenUsed="1"/>
+    <w:lsdException w:name="Table Columns 5" w:semiHidden="1" w:unhideWhenUsed="1"/>
+    <w:lsdException w:name="Table Grid 1" w:semiHidden="1" w:unhideWhenUsed="1"/>
+    <w:lsdException w:name="Table Grid 2" w:semiHidden="1" w:unhideWhenUsed="1"/>
+    <w:lsdException w:name="Table Grid 3" w:semiHidden="1" w:unhideWhenUsed="1"/>
+    <w:lsdException w:name="Table Grid 4" w:semiHidden="1" w:unhideWhenUsed="1"/>
+    <w:lsdException w:name="Table Grid 5" w:semiHidden="1" w:unhideWhenUsed="1"/>
+    <w:lsdException w:name="Table Grid 6" w:semiHidden="1" w:unhideWhenUsed="1"/>
+    <w:lsdException w:name="Table Grid 7" w:semiHidden="1" w:unhideWhenUsed="1"/>
+    <w:lsdException w:name="Table Grid 8" w:semiHidden="1" w:unhideWhenUsed="1"/>
+    <w:lsdException w:name="Table List 1" w:semiHidden="1" w:unhideWhenUsed="1"/>
+    <w:lsdException w:name="Table List 2" w:semiHidden="1" w:unhideWhenUsed="1"/>
+    <w:lsdException w:name="Table List 3" w:semiHidden="1" w:unhideWhenUsed="1"/>
+    <w:lsdException w:name="Table List 4" w:semiHidden="1" w:unhideWhenUsed="1"/>
+    <w:lsdException w:name="Table List 5" w:semiHidden="1" w:unhideWhenUsed="1"/>
+    <w:lsdException w:name="Table List 6" w:semiHidden="1" w:unhideWhenUsed="1"/>
+    <w:lsdException w:name="Table List 7" w:semiHidden="1" w:unhideWhenUsed="1"/>
+    <w:lsdException w:name="Table List 8" w:semiHidden="1" w:unhideWhenUsed="1"/>
+    <w:lsdException w:name="Table 3D effects 1" w:semiHidden="1" w:unhideWhenUsed="1"/>
+    <w:lsdException w:name="Table 3D effects 2" w:semiHidden="1" w:unhideWhenUsed="1"/>
+    <w:lsdException w:name="Table 3D effects 3" w:semiHidden="1" w:unhideWhenUsed="1"/>
+    <w:lsdException w:name="Table Contemporary" w:semiHidden="1" w:unhideWhenUsed="1"/>
+    <w:lsdException w:name="Table Elegant" w:semiHidden="1" w:unhideWhenUsed="1"/>
+    <w:lsdException w:name="Table Professional" w:semiHidden="1" w:unhideWhenUsed="1"/>
+    <w:lsdException w:name="Table Subtle 1" w:semiHidden="1" w:unhideWhenUsed="1"/>
+    <w:lsdException w:name="Table Subtle 2" w:semiHidden="1" w:unhideWhenUsed="1"/>
+    <w:lsdException w:name="Table Web 1" w:semiHidden="1" w:unhideWhenUsed="1"/>
+    <w:lsdException w:name="Table Web 2" w:semiHidden="1" w:unhideWhenUsed="1"/>
+    <w:lsdException w:name="Table Web 3" w:semiHidden="1" w:unhideWhenUsed="1"/>
+    <w:lsdException w:name="Table Theme" w:semiHidden="1" w:unhideWhenUsed="1"/>
+    <w:lsdException w:name="Light Shading"/>
+    <w:lsdException w:name="Light List"/>
+    <w:lsdException w:name="Light Grid"/>
+    <w:lsdException w:name="Medium Shading 1"/>
+    <w:lsdException w:name="Medium Shading 2"/>
+    <w:lsdException w:name="Medium List 1"/>
+    <w:lsdException w:name="Medium List 2"/>
+    <w:lsdException w:name="Medium Grid 1"/>
+    <w:lsdException w:name="Medium Grid 2"/>
+    <w:lsdException w:name="Medium Grid 3"/>
+    <w:lsdException w:name="Dark List"/>
+    <w:lsdException w:name="Colorful Shading"/>
+    <w:lsdException w:name="Colorful List"/>
+    <w:lsdException w:name="Colorful Grid"/>
+    <w:lsdException w:name="Light Shading Accent 1"/>
+    <w:lsdException w:name="Light List Accent 1"/>
+    <w:lsdException w:name="Light Grid Accent 1"/>
+    <w:lsdException w:name="Medium Shading 1 Accent 1"/>
+    <w:lsdException w:name="Medium Shading 2 Accent 1"/>
+    <w:lsdException w:name="Medium List 1 Accent 1"/>
+    <w:lsdException w:name="Medium List 2 Accent 1"/>
+    <w:lsdException w:name="Medium Grid 1 Accent 1"/>
+    <w:lsdException w:name="Medium Grid 2 Accent 1"/>
+    <w:lsdException w:name="Medium Grid 3 Accent 1"/>
+    <w:lsdException w:name="Dark List Accent 1"/>
+    <w:lsdException w:name="Colorful Shading Accent 1"/>
+    <w:lsdException w:name="Colorful List Accent 1"/>
+    <w:lsdException w:name="Colorful Grid Accent 1"/>
+    <w:lsdException w:name="Light Shading Accent 2"/>
+    <w:lsdException w:name="Light List Accent 2"/>
+    <w:lsdException w:name="Light Grid Accent 2"/>
+    <w:lsdException w:name="Medium Shading 1 Accent 2"/>
+    <w:lsdException w:name="Medium Shading 2 Accent 2"/>
+    <w:lsdException w:name="Medium List 1 Accent 2"/>
+    <w:lsdException w:name="Medium List 2 Accent 2"/>
+    <w:lsdException w:name="Medium Grid 1 Accent 2"/>
+    <w:lsdException w:name="Medium Grid 2 Accent 2"/>
+    <w:lsdException w:name="Medium Grid 3 Accent 2"/>
+    <w:lsdException w:name="Dark List Accent 2"/>
+    <w:lsdException w:name="Colorful Shading Accent 2"/>
+    <w:lsdException w:name="Colorful List Accent 2"/>
+    <w:lsdException w:name="Colorful Grid Accent 2"/>
+    <w:lsdException w:name="Light Shading Accent 3"/>
+    <w:lsdException w:name="Light List Accent 3"/>
+    <w:lsdException w:name="Light Grid Accent 3"/>
+    <w:lsdException w:name="Medium Shading 1 Accent 3"/>
+    <w:lsdException w:name="Medium Shading 2 Accent 3"/>
+    <w:lsdException w:name="Medium List 1 Accent 3"/>
+    <w:lsdException w:name="Medium List 2 Accent 3"/>
+    <w:lsdException w:name="Medium Grid 1 Accent 3"/>
+    <w:lsdException w:name="Medium Grid 2 Accent 3"/>
+    <w:lsdException w:name="Medium Grid 3 Accent 3"/>
+    <w:lsdException w:name="Dark List Accent 3"/>
+    <w:lsdException w:name="Colorful Shading Accent 3"/>
+    <w:lsdException w:name="Colorful List Accent 3"/>
+    <w:lsdException w:name="Colorful Grid Accent 3"/>
+    <w:lsdException w:name="Light Shading Accent 4"/>
+    <w:lsdException w:name="Light List Accent 4"/>
+    <w:lsdException w:name="Light Grid Accent 4"/>
+    <w:lsdException w:name="Medium Shading 1 Accent 4"/>
+    <w:lsdException w:name="Medium Shading 2 Accent 4"/>
+    <w:lsdException w:name="Medium List 1 Accent 4"/>
+    <w:lsdException w:name="Medium List 2 Accent 4"/>
+    <w:lsdException w:name="Medium Grid 1 Accent 4"/>
+    <w:lsdException w:name="Medium Grid 2 Accent 4"/>
+    <w:lsdException w:name="Medium Grid 3 Accent 4"/>
+    <w:lsdException w:name="Dark List Accent 4"/>
+    <w:lsdException w:name="Colorful Shading Accent 4"/>
+    <w:lsdException w:name="Colorful List Accent 4"/>
+    <w:lsdException w:name="Colorful Grid Accent 4"/>
+    <w:lsdException w:name="Light Shading Accent 5"/>
+    <w:lsdException w:name="Light List Accent 5"/>
+    <w:lsdException w:name="Light Grid Accent 5"/>
+    <w:lsdException w:name="Medium Shading 1 Accent 5"/>
+    <w:lsdException w:name="Medium Shading 2 Accent 5"/>
+    <w:lsdException w:name="Medium List 1 Accent 5"/>
+    <w:lsdException w:name="Medium List 2 Accent 5"/>
+    <w:lsdException w:name="Medium Grid 1 Accent 5"/>
+    <w:lsdException w:name="Medium Grid 2 Accent 5"/>
+    <w:lsdException w:name="Medium Grid 3 Accent 5"/>
+    <w:lsdException w:name="Dark List Accent 5"/>
+    <w:lsdException w:name="Colorful Shading Accent 5"/>
+    <w:lsdException w:name="Colorful List Accent 5"/>
+    <w:lsdException w:name="Colorful Grid Accent 5"/>
+    <w:lsdException w:name="Light Shading Accent 6"/>
+    <w:lsdException w:name="Light List Accent 6"/>
+    <w:lsdException w:name="Light Grid Accent 6"/>
+    <w:lsdException w:name="Medium Shading 1 Accent 6"/>
+    <w:lsdException w:name="Medium Shading 2 Accent 6"/>
+    <w:lsdException w:name="Medium List 1 Accent 6"/>
+    <w:lsdException w:name="Medium List 2 Accent 6"/>
+    <w:lsdException w:name="Medium Grid 1 Accent 6"/>
+    <w:lsdException w:name="Medium Grid 2 Accent 6"/>
+    <w:lsdException w:name="Medium Grid 3 Accent 6"/>
+    <w:lsdException w:name="Dark List Accent 6"/>
+    <w:lsdException w:name="Colorful Shading Accent 6"/>
+    <w:lsdException w:name="Colorful List Accent 6"/>
+    <w:lsdException w:name="Colorful Grid Accent 6"/>
+    <w:lsdException w:name="Grid Table 4" w:uiPriority="49"/>
+    <w:lsdException w:name="Grid Table 5 Dark" w:uiPriority="50"/>
+    <w:lsdException w:name="Grid Table 6 Colorful" w:uiPriority="51"/>
+    <w:lsdException w:name="Grid Table 7 Colorful" w:uiPriority="52"/>
+    <w:lsdException w:name="Grid Table 1 Light Accent 1" w:uiPriority="46"/>
+    <w:lsdException w:name="Grid Table 2 Accent 1" w:uiPriority="47"/>
+    <w:lsdException w:name="Grid Table 3 Accent 1" w:uiPriority="48"/>
+    <w:lsdException w:name="Grid Table 4 Accent 1" w:uiPriority="49"/>
+    <w:lsdException w:name="Grid Table 5 Dark Accent 1" w:uiPriority="50"/>
+    <w:lsdException w:name="Grid Table 6 Colorful Accent 1" w:uiPriority="51"/>
+    <w:lsdException w:name="Grid Table 7 Colorful Accent 1" w:uiPriority="52"/>
+    <w:lsdException w:name="Grid Table 1 Light Accent 2" w:uiPriority="46"/>
+    <w:lsdException w:name="Grid Table 2 Accent 2" w:uiPriority="47"/>
+    <w:lsdException w:name="Grid Table 3 Accent 2" w:uiPriority="48"/>
+    <w:lsdException w:name="Grid Table 4 Accent 2" w:uiPriority="49"/>
+    <w:lsdException w:name="Grid Table 5 Dark Accent 2" w:uiPriority="50"/>
+    <w:lsdException w:name="Grid Table 6 Colorful Accent 2" w:uiPriority="51"/>
+    <w:lsdException w:name="Grid Table 7 Colorful Accent 2" w:uiPriority="52"/>
+    <w:lsdException w:name="Grid Table 1 Light Accent 3" w:uiPriority="46"/>
+    <w:lsdException w:name="Grid Table 2 Accent 3" w:uiPriority="47"/>
+    <w:lsdException w:name="Grid Table 3 Accent 3" w:uiPriority="48"/>
+    <w:lsdException w:name="Grid Table 4 Accent 3" w:uiPriority="49"/>
+    <w:lsdException w:name="Grid Table 5 Dark Accent 3" w:uiPriority="50"/>
+    <w:lsdException w:name="Grid Table 6 Colorful Accent 3" w:uiPriority="51"/>
+    <w:lsdException w:name="Grid Table 7 Colorful Accent 3" w:uiPriority="52"/>
+    <w:lsdException w:name="Grid Table 1 Light Accent 4" w:uiPriority="46"/>
+    <w:lsdException w:name="Grid Table 2 Accent 4" w:uiPriority="47"/>
+    <w:lsdException w:name="Grid Table 3 Accent 4" w:uiPriority="48"/>
+    <w:lsdException w:name="Grid Table 4 Accent 4" w:uiPriority="49"/>
+    <w:lsdException w:name="Grid Table 5 Dark Accent 4" w:uiPriority="50"/>
+    <w:lsdException w:name="Grid Table 6 Colorful Accent 4" w:uiPriority="51"/>
+    <w:lsdException w:name="Grid Table 7 Colorful Accent 4" w:uiPriority="52"/>
+    <w:lsdException w:name="Grid Table 1 Light Accent 5" w:uiPriority="46"/>
+    <w:lsdException w:name="Grid Table 2 Accent 5" w:uiPriority="47"/>
+    <w:lsdException w:name="Grid Table 3 Accent 5" w:uiPriority="48"/>
+    <w:lsdException w:name="Grid Table 4 Accent 5" w:uiPriority="49"/>
+    <w:lsdException w:name="Grid Table 5 Dark Accent 5" w:uiPriority="50"/>
+    <w:lsdException w:name="Grid Table 6 Colorful Accent 5" w:uiPriority="51"/>
+    <w:lsdException w:name="Grid Table 7 Colorful Accent 5" w:uiPriority="52"/>
+    <w:lsdException w:name="Grid Table 1 Light Accent 6" w:uiPriority="46"/>
+    <w:lsdException w:name="Grid Table 2 Accent 6" w:uiPriority="47"/>
+    <w:lsdException w:name="Grid Table 3 Accent 6" w:uiPriority="48"/>
+    <w:lsdException w:name="Grid Table 4 Accent 6" w:uiPriority="49"/>
+    <w:lsdException w:name="Grid Table 5 Dark Accent 6" w:uiPriority="50"/>
+    <w:lsdException w:name="Grid Table 6 Colorful Accent 6" w:uiPriority="51"/>
+    <w:lsdException w:name="Grid Table 7 Colorful Accent 6" w:uiPriority="52"/>
+    <w:lsdException w:name="List Table 1 Light" w:uiPriority="46"/>
+    <w:lsdException w:name="List Table 2" w:uiPriority="47"/>
+    <w:lsdException w:name="List Table 3" w:uiPriority="48"/>
+    <w:lsdException w:name="List Table 4" w:uiPriority="49"/>
+    <w:lsdException w:name="List Table 5 Dark" w:uiPriority="50"/>
+    <w:lsdException w:name="List Table 6 Colorful" w:uiPriority="51"/>
+    <w:lsdException w:name="List Table 7 Colorful" w:uiPriority="52"/>
+    <w:lsdException w:name="List Table 1 Light Accent 1" w:uiPriority="46"/>
+    <w:lsdException w:name="List Table 2 Accent 1" w:uiPriority="47"/>
+    <w:lsdException w:name="List Table 3 Accent 1" w:uiPriority="48"/>
+    <w:lsdException w:name="List Table 4 Accent 1" w:uiPriority="49"/>
+    <w:lsdException w:name="List Table 5 Dark Accent 1" w:uiPriority="50"/>
+    <w:lsdException w:name="List Table 6 Colorful Accent 1" w:uiPriority="51"/>
+    <w:lsdException w:name="List Table 7 Colorful Accent 1" w:uiPriority="52"/>
+    <w:lsdException w:name="List Table 1 Light Accent 2" w:uiPriority="46"/>
+    <w:lsdException w:name="List Table 2 Accent 2" w:uiPriority="47"/>
+    <w:lsdException w:name="List Table 3 Accent 2" w:uiPriority="48"/>
+    <w:lsdException w:name="List Table 4 Accent 2" w:uiPriority="49"/>
+    <w:lsdException w:name="List Table 5 Dark Accent 2" w:uiPriority="50"/>
+    <w:lsdException w:name="List Table 6 Colorful Accent 2" w:uiPriority="51"/>
+    <w:lsdException w:name="List Table 7 Colorful Accent 2" w:uiPriority="52"/>
+    <w:lsdException w:name="List Table 1 Light Accent 3" w:uiPriority="46"/>
+    <w:lsdException w:name="List Table 2 Accent 3" w:uiPriority="47"/>
+    <w:lsdException w:name="List Table 3 Accent 3" w:uiPriority="48"/>
+    <w:lsdException w:name="List Table 4 Accent 3" w:uiPriority="49"/>
+    <w:lsdException w:name="List Table 5 Dark Accent 3" w:uiPriority="50"/>
+    <w:lsdException w:name="List Table 6 Colorful Accent 3" w:uiPriority="51"/>
+    <w:lsdException w:name="List Table 7 Colorful Accent 3" w:uiPriority="52"/>
+    <w:lsdException w:name="List Table 1 Light Accent 4" w:uiPriority="46"/>
+    <w:lsdException w:name="List Table 2 Accent 4" w:uiPriority="47"/>
+    <w:lsdException w:name="List Table 3 Accent 4" w:uiPriority="48"/>
+    <w:lsdException w:name="List Table 4 Accent 4" w:uiPriority="49"/>
+    <w:lsdException w:name="List Table 5 Dark Accent 4" w:uiPriority="50"/>
+    <w:lsdException w:name="List Table 6 Colorful Accent 4" w:uiPriority="51"/>
+    <w:lsdException w:name="List Table 7 Colorful Accent 4" w:uiPriority="52"/>
+    <w:lsdException w:name="List Table 1 Light Accent 5" w:uiPriority="46"/>
+    <w:lsdException w:name="List Table 2 Accent 5" w:uiPriority="47"/>
+    <w:lsdException w:name="List Table 3 Accent 5" w:uiPriority="48"/>
+    <w:lsdException w:name="List Table 4 Accent 5" w:uiPriority="49"/>
+    <w:lsdException w:name="List Table 5 Dark Accent 5" w:uiPriority="50"/>
+    <w:lsdException w:name="List Table 6 Colorful Accent 5" w:uiPriority="51"/>
+    <w:lsdException w:name="List Table 7 Colorful Accent 5" w:uiPriority="52"/>
+    <w:lsdException w:name="List Table 1 Light Accent 6" w:uiPriority="46"/>
+    <w:lsdException w:name="List Table 2 Accent 6" w:uiPriority="47"/>
+    <w:lsdException w:name="List Table 3 Accent 6" w:uiPriority="48"/>
+    <w:lsdException w:name="List Table 4 Accent 6" w:uiPriority="49"/>
+    <w:lsdException w:name="List Table 5 Dark Accent 6" w:uiPriority="50"/>
+    <w:lsdException w:name="List Table 6 Colorful Accent 6" w:uiPriority="51"/>
+    <w:lsdException w:name="List Table 7 Colorful Accent 6" w:uiPriority="52"/>
+    <w:lsdException w:name="Mention" w:semiHidden="1" w:uiPriority="99" w:unhideWhenUsed="1"/>
+    <w:lsdException w:name="Smart Hyperlink" w:semiHidden="1" w:uiPriority="99" w:unhideWhenUsed="1"/>
+    <w:lsdException w:name="Hashtag" w:semiHidden="1" w:uiPriority="99" w:unhideWhenUsed="1"/>
+    <w:lsdException w:name="Unresolved Mention" w:semiHidden="1" w:uiPriority="99" w:unhideWhenUsed="1"/>
+    <w:lsdException w:name="Smart Link" w:semiHidden="1" w:uiPriority="99" w:unhideWhenUsed="1"/>
+  </w:latentStyles>
+  <w:style w:type="paragraph" w:default="1" w:styleId="Normal">
     <w:name w:val="Normal"/>
     <w:qFormat/>
   </w:style>
-  <w:style w:styleId="BodyText" w:type="paragraph">
-    <w:name w:val="Body Text"/>
-    <w:basedOn w:val="Normal"/>
-    <w:link w:val="BodyTextChar"/>
-    <w:qFormat/>
-    <w:pPr>
-      <w:spacing w:after="180" w:before="180"/>
-    </w:pPr>
-  </w:style>
-  <w:style w:customStyle="1" w:styleId="FirstParagraph" w:type="paragraph">
-    <w:name w:val="First Paragraph"/>
-    <w:basedOn w:val="BodyText"/>
-    <w:next w:val="BodyText"/>
-    <w:qFormat/>
-  </w:style>
-  <w:style w:customStyle="1" w:styleId="Compact" w:type="paragraph">
-    <w:name w:val="Compact"/>
-    <w:basedOn w:val="BodyText"/>
-    <w:qFormat/>
-    <w:pPr>
-      <w:spacing w:after="36" w:before="36"/>
-    </w:pPr>
-  </w:style>
-  <w:style w:styleId="Title" w:type="paragraph">
-    <w:name w:val="Title"/>
-    <w:basedOn w:val="Normal"/>
-    <w:next w:val="BodyText"/>
-    <w:link w:val="TitleChar"/>
-    <w:uiPriority w:val="10"/>
-    <w:qFormat/>
-    <w:rsid w:val="00A10FD9"/>
-    <w:pPr>
-      <w:spacing w:after="80" w:line="240" w:lineRule="auto"/>
-      <w:contextualSpacing/>
-      <w:jc w:val="center"/>
-    </w:pPr>
-    <w:rPr>
-      <w:rFonts w:asciiTheme="majorHAnsi" w:cstheme="majorBidi" w:eastAsiaTheme="majorEastAsia" w:hAnsiTheme="majorHAnsi"/>
-      <w:sz w:val="56"/>
-      <w:szCs w:val="56"/>
-    </w:rPr>
-  </w:style>
-  <w:style w:customStyle="1" w:styleId="TitleChar" w:type="character">
-    <w:name w:val="Title Char"/>
-    <w:basedOn w:val="DefaultParagraphFont"/>
-    <w:link w:val="Title"/>
-    <w:uiPriority w:val="10"/>
-    <w:rsid w:val="00A10FD9"/>
-    <w:rPr>
-      <w:rFonts w:asciiTheme="majorHAnsi" w:cstheme="majorBidi" w:eastAsiaTheme="majorEastAsia" w:hAnsiTheme="majorHAnsi"/>
-      <w:sz w:val="56"/>
-      <w:szCs w:val="56"/>
-    </w:rPr>
-  </w:style>
-  <w:style w:styleId="Subtitle" w:type="paragraph">
-    <w:name w:val="Subtitle"/>
-    <w:basedOn w:val="Title"/>
-    <w:next w:val="BodyText"/>
-    <w:link w:val="SubtitleChar"/>
-    <w:uiPriority w:val="11"/>
-    <w:qFormat/>
-    <w:rsid w:val="00A10FD9"/>
-    <w:pPr>
-      <w:numPr>
-        <w:ilvl w:val="1"/>
-      </w:numPr>
-    </w:pPr>
-    <w:rPr>
-      <w:rFonts w:cstheme="majorBidi" w:eastAsiaTheme="majorEastAsia"/>
-      <w:spacing w:val="15"/>
-      <w:sz w:val="28"/>
-      <w:szCs w:val="28"/>
-    </w:rPr>
-  </w:style>
-  <w:style w:customStyle="1" w:styleId="SubtitleChar" w:type="character">
-    <w:name w:val="Subtitle Char"/>
-    <w:basedOn w:val="DefaultParagraphFont"/>
-    <w:link w:val="Subtitle"/>
-    <w:uiPriority w:val="11"/>
-    <w:rsid w:val="00A10FD9"/>
-    <w:rPr>
-      <w:rFonts w:cstheme="majorBidi" w:eastAsiaTheme="majorEastAsia"/>
-      <w:color w:themeColor="text1" w:themeTint="A6" w:val="595959"/>
-      <w:spacing w:val="15"/>
-      <w:sz w:val="28"/>
-      <w:szCs w:val="28"/>
-    </w:rPr>
-  </w:style>
-  <w:style w:customStyle="1" w:styleId="Author" w:type="paragraph">
-    <w:name w:val="Author"/>
-    <w:basedOn w:val="Title"/>
-    <w:next w:val="BodyText"/>
-    <w:qFormat/>
-    <w:pPr>
-      <w:keepNext/>
-      <w:keepLines/>
-    </w:pPr>
-    <w:rPr>
-      <w:sz w:val="24"/>
-      <w:szCs w:val="24"/>
-    </w:rPr>
-  </w:style>
-  <w:style w:styleId="Date" w:type="paragraph">
-    <w:name w:val="Date"/>
-    <w:basedOn w:val="Title"/>
-    <w:next w:val="BodyText"/>
-    <w:qFormat/>
-    <w:pPr>
-      <w:keepNext/>
-      <w:keepLines/>
-    </w:pPr>
-    <w:rPr>
-      <w:sz w:val="24"/>
-      <w:szCs w:val="24"/>
-    </w:rPr>
-  </w:style>
-  <w:style w:customStyle="1" w:styleId="AbstractTitle" w:type="paragraph">
-    <w:name w:val="Abstract Title"/>
-    <w:basedOn w:val="Normal"/>
-    <w:next w:val="Abstract"/>
-    <w:qFormat/>
-    <w:pPr>
-      <w:keepNext/>
-      <w:keepLines/>
-      <w:spacing w:after="0" w:before="300"/>
-      <w:jc w:val="center"/>
-    </w:pPr>
-    <w:rPr>
-      <w:b/>
-      <w:sz w:val="20"/>
-      <w:szCs w:val="20"/>
-    </w:rPr>
-  </w:style>
-  <w:style w:customStyle="1" w:styleId="Abstract" w:type="paragraph">
-    <w:name w:val="Abstract"/>
-    <w:basedOn w:val="Normal"/>
-    <w:next w:val="BodyText"/>
-    <w:qFormat/>
-    <w:pPr>
-      <w:keepNext/>
-      <w:keepLines/>
-      <w:spacing w:after="300" w:before="100"/>
-    </w:pPr>
-    <w:rPr>
-      <w:sz w:val="20"/>
-      <w:szCs w:val="20"/>
-    </w:rPr>
-  </w:style>
-  <w:style w:styleId="Bibliography" w:type="paragraph">
-    <w:name w:val="Bibliography"/>
-    <w:basedOn w:val="Normal"/>
-    <w:next w:val="Bibliography"/>
-    <w:qFormat/>
-    <w:pPr/>
-    <w:rPr/>
-  </w:style>
-  <w:style w:styleId="Heading1" w:type="paragraph">
+  <w:style w:type="paragraph" w:styleId="Heading1">
     <w:name w:val="heading 1"/>
     <w:basedOn w:val="Normal"/>
     <w:next w:val="BodyText"/>
@@ -1475,17 +1500,17 @@
     <w:pPr>
       <w:keepNext/>
       <w:keepLines/>
-      <w:spacing w:after="80" w:before="360"/>
+      <w:spacing w:before="360" w:after="80"/>
       <w:outlineLvl w:val="0"/>
     </w:pPr>
     <w:rPr>
-      <w:rFonts w:asciiTheme="majorHAnsi" w:cstheme="majorBidi" w:eastAsiaTheme="majorEastAsia" w:hAnsiTheme="majorHAnsi"/>
-      <w:color w:themeColor="accent1" w:themeShade="BF" w:val="0F4761"/>
+      <w:rFonts w:asciiTheme="majorHAnsi" w:eastAsiaTheme="majorEastAsia" w:hAnsiTheme="majorHAnsi" w:cstheme="majorBidi"/>
+      <w:color w:val="0F4761" w:themeColor="accent1" w:themeShade="BF"/>
       <w:sz w:val="40"/>
       <w:szCs w:val="40"/>
     </w:rPr>
   </w:style>
-  <w:style w:styleId="Heading2" w:type="paragraph">
+  <w:style w:type="paragraph" w:styleId="Heading2">
     <w:name w:val="heading 2"/>
     <w:basedOn w:val="Normal"/>
     <w:next w:val="BodyText"/>
@@ -1498,17 +1523,17 @@
     <w:pPr>
       <w:keepNext/>
       <w:keepLines/>
-      <w:spacing w:after="80" w:before="160"/>
+      <w:spacing w:before="160" w:after="80"/>
       <w:outlineLvl w:val="1"/>
     </w:pPr>
     <w:rPr>
-      <w:rFonts w:asciiTheme="majorHAnsi" w:cstheme="majorBidi" w:eastAsiaTheme="majorEastAsia" w:hAnsiTheme="majorHAnsi"/>
-      <w:color w:themeColor="accent1" w:themeShade="BF" w:val="0F4761"/>
+      <w:rFonts w:asciiTheme="majorHAnsi" w:eastAsiaTheme="majorEastAsia" w:hAnsiTheme="majorHAnsi" w:cstheme="majorBidi"/>
+      <w:color w:val="0F4761" w:themeColor="accent1" w:themeShade="BF"/>
       <w:sz w:val="32"/>
       <w:szCs w:val="32"/>
     </w:rPr>
   </w:style>
-  <w:style w:styleId="Heading3" w:type="paragraph">
+  <w:style w:type="paragraph" w:styleId="Heading3">
     <w:name w:val="heading 3"/>
     <w:basedOn w:val="Normal"/>
     <w:next w:val="BodyText"/>
@@ -1521,17 +1546,17 @@
     <w:pPr>
       <w:keepNext/>
       <w:keepLines/>
-      <w:spacing w:after="80" w:before="160"/>
+      <w:spacing w:before="160" w:after="80"/>
       <w:outlineLvl w:val="2"/>
     </w:pPr>
     <w:rPr>
-      <w:rFonts w:cstheme="majorBidi" w:eastAsiaTheme="majorEastAsia"/>
-      <w:color w:themeColor="accent1" w:themeShade="BF" w:val="0F4761"/>
+      <w:rFonts w:eastAsiaTheme="majorEastAsia" w:cstheme="majorBidi"/>
+      <w:color w:val="0F4761" w:themeColor="accent1" w:themeShade="BF"/>
       <w:sz w:val="28"/>
       <w:szCs w:val="28"/>
     </w:rPr>
   </w:style>
-  <w:style w:styleId="Heading4" w:type="paragraph">
+  <w:style w:type="paragraph" w:styleId="Heading4">
     <w:name w:val="heading 4"/>
     <w:basedOn w:val="Normal"/>
     <w:next w:val="BodyText"/>
@@ -1544,17 +1569,17 @@
     <w:pPr>
       <w:keepNext/>
       <w:keepLines/>
-      <w:spacing w:after="40" w:before="80"/>
+      <w:spacing w:before="80" w:after="40"/>
       <w:outlineLvl w:val="3"/>
     </w:pPr>
     <w:rPr>
-      <w:rFonts w:cstheme="majorBidi" w:eastAsiaTheme="majorEastAsia"/>
+      <w:rFonts w:eastAsiaTheme="majorEastAsia" w:cstheme="majorBidi"/>
       <w:i/>
       <w:iCs/>
-      <w:color w:themeColor="accent1" w:themeShade="BF" w:val="0F4761"/>
-    </w:rPr>
-  </w:style>
-  <w:style w:styleId="Heading5" w:type="paragraph">
+      <w:color w:val="0F4761" w:themeColor="accent1" w:themeShade="BF"/>
+    </w:rPr>
+  </w:style>
+  <w:style w:type="paragraph" w:styleId="Heading5">
     <w:name w:val="heading 5"/>
     <w:basedOn w:val="Normal"/>
     <w:next w:val="BodyText"/>
@@ -1567,15 +1592,15 @@
     <w:pPr>
       <w:keepNext/>
       <w:keepLines/>
-      <w:spacing w:after="40" w:before="80"/>
+      <w:spacing w:before="80" w:after="40"/>
       <w:outlineLvl w:val="4"/>
     </w:pPr>
     <w:rPr>
-      <w:rFonts w:cstheme="majorBidi" w:eastAsiaTheme="majorEastAsia"/>
-      <w:color w:themeColor="accent1" w:themeShade="BF" w:val="0F4761"/>
-    </w:rPr>
-  </w:style>
-  <w:style w:styleId="Heading6" w:type="paragraph">
+      <w:rFonts w:eastAsiaTheme="majorEastAsia" w:cstheme="majorBidi"/>
+      <w:color w:val="0F4761" w:themeColor="accent1" w:themeShade="BF"/>
+    </w:rPr>
+  </w:style>
+  <w:style w:type="paragraph" w:styleId="Heading6">
     <w:name w:val="heading 6"/>
     <w:basedOn w:val="Normal"/>
     <w:next w:val="BodyText"/>
@@ -1588,17 +1613,17 @@
     <w:pPr>
       <w:keepNext/>
       <w:keepLines/>
-      <w:spacing w:after="0" w:before="40"/>
+      <w:spacing w:before="40" w:after="0"/>
       <w:outlineLvl w:val="5"/>
     </w:pPr>
     <w:rPr>
-      <w:rFonts w:cstheme="majorBidi" w:eastAsiaTheme="majorEastAsia"/>
+      <w:rFonts w:eastAsiaTheme="majorEastAsia" w:cstheme="majorBidi"/>
       <w:i/>
       <w:iCs/>
-      <w:color w:themeColor="text1" w:themeTint="A6" w:val="595959"/>
-    </w:rPr>
-  </w:style>
-  <w:style w:styleId="Heading7" w:type="paragraph">
+      <w:color w:val="595959" w:themeColor="text1" w:themeTint="A6"/>
+    </w:rPr>
+  </w:style>
+  <w:style w:type="paragraph" w:styleId="Heading7">
     <w:name w:val="heading 7"/>
     <w:basedOn w:val="Normal"/>
     <w:next w:val="BodyText"/>
@@ -1611,15 +1636,15 @@
     <w:pPr>
       <w:keepNext/>
       <w:keepLines/>
-      <w:spacing w:after="0" w:before="40"/>
+      <w:spacing w:before="40" w:after="0"/>
       <w:outlineLvl w:val="6"/>
     </w:pPr>
     <w:rPr>
-      <w:rFonts w:cstheme="majorBidi" w:eastAsiaTheme="majorEastAsia"/>
-      <w:color w:themeColor="text1" w:themeTint="A6" w:val="595959"/>
-    </w:rPr>
-  </w:style>
-  <w:style w:styleId="Heading8" w:type="paragraph">
+      <w:rFonts w:eastAsiaTheme="majorEastAsia" w:cstheme="majorBidi"/>
+      <w:color w:val="595959" w:themeColor="text1" w:themeTint="A6"/>
+    </w:rPr>
+  </w:style>
+  <w:style w:type="paragraph" w:styleId="Heading8">
     <w:name w:val="heading 8"/>
     <w:basedOn w:val="Normal"/>
     <w:next w:val="BodyText"/>
@@ -1636,13 +1661,13 @@
       <w:outlineLvl w:val="7"/>
     </w:pPr>
     <w:rPr>
-      <w:rFonts w:cstheme="majorBidi" w:eastAsiaTheme="majorEastAsia"/>
+      <w:rFonts w:eastAsiaTheme="majorEastAsia" w:cstheme="majorBidi"/>
       <w:i/>
       <w:iCs/>
-      <w:color w:themeColor="text1" w:themeTint="D8" w:val="272727"/>
-    </w:rPr>
-  </w:style>
-  <w:style w:styleId="Heading9" w:type="paragraph">
+      <w:color w:val="272727" w:themeColor="text1" w:themeTint="D8"/>
+    </w:rPr>
+  </w:style>
+  <w:style w:type="paragraph" w:styleId="Heading9">
     <w:name w:val="heading 9"/>
     <w:basedOn w:val="Normal"/>
     <w:next w:val="BodyText"/>
@@ -1659,24 +1684,202 @@
       <w:outlineLvl w:val="8"/>
     </w:pPr>
     <w:rPr>
-      <w:rFonts w:cstheme="majorBidi" w:eastAsiaTheme="majorEastAsia"/>
-      <w:color w:themeColor="text1" w:themeTint="D8" w:val="272727"/>
-    </w:rPr>
-  </w:style>
-  <w:style w:customStyle="1" w:styleId="Heading1Char" w:type="character">
+      <w:rFonts w:eastAsiaTheme="majorEastAsia" w:cstheme="majorBidi"/>
+      <w:color w:val="272727" w:themeColor="text1" w:themeTint="D8"/>
+    </w:rPr>
+  </w:style>
+  <w:style w:type="character" w:default="1" w:styleId="DefaultParagraphFont">
+    <w:name w:val="Default Paragraph Font"/>
+    <w:uiPriority w:val="1"/>
+    <w:semiHidden/>
+    <w:unhideWhenUsed/>
+  </w:style>
+  <w:style w:type="table" w:default="1" w:styleId="TableNormal">
+    <w:name w:val="Normal Table"/>
+    <w:uiPriority w:val="99"/>
+    <w:semiHidden/>
+    <w:unhideWhenUsed/>
+    <w:tblPr>
+      <w:tblInd w:w="0" w:type="dxa"/>
+      <w:tblCellMar>
+        <w:top w:w="0" w:type="dxa"/>
+        <w:left w:w="108" w:type="dxa"/>
+        <w:bottom w:w="0" w:type="dxa"/>
+        <w:right w:w="108" w:type="dxa"/>
+      </w:tblCellMar>
+    </w:tblPr>
+  </w:style>
+  <w:style w:type="numbering" w:default="1" w:styleId="NoList">
+    <w:name w:val="No List"/>
+    <w:uiPriority w:val="99"/>
+    <w:semiHidden/>
+    <w:unhideWhenUsed/>
+  </w:style>
+  <w:style w:type="paragraph" w:styleId="BodyText">
+    <w:name w:val="Body Text"/>
+    <w:basedOn w:val="Normal"/>
+    <w:qFormat/>
+    <w:pPr>
+      <w:spacing w:before="180" w:after="180"/>
+    </w:pPr>
+  </w:style>
+  <w:style w:type="paragraph" w:customStyle="1" w:styleId="FirstParagraph">
+    <w:name w:val="First Paragraph"/>
+    <w:basedOn w:val="BodyText"/>
+    <w:next w:val="BodyText"/>
+    <w:qFormat/>
+  </w:style>
+  <w:style w:type="paragraph" w:customStyle="1" w:styleId="Compact">
+    <w:name w:val="Compact"/>
+    <w:basedOn w:val="BodyText"/>
+    <w:qFormat/>
+    <w:pPr>
+      <w:spacing w:before="36" w:after="36"/>
+    </w:pPr>
+  </w:style>
+  <w:style w:type="paragraph" w:styleId="Title">
+    <w:name w:val="Title"/>
+    <w:basedOn w:val="Normal"/>
+    <w:next w:val="BodyText"/>
+    <w:link w:val="TitleChar"/>
+    <w:uiPriority w:val="10"/>
+    <w:qFormat/>
+    <w:rsid w:val="00A10FD9"/>
+    <w:pPr>
+      <w:spacing w:after="80"/>
+      <w:contextualSpacing/>
+      <w:jc w:val="center"/>
+    </w:pPr>
+    <w:rPr>
+      <w:rFonts w:asciiTheme="majorHAnsi" w:eastAsiaTheme="majorEastAsia" w:hAnsiTheme="majorHAnsi" w:cstheme="majorBidi"/>
+      <w:sz w:val="56"/>
+      <w:szCs w:val="56"/>
+    </w:rPr>
+  </w:style>
+  <w:style w:type="character" w:customStyle="1" w:styleId="TitleChar">
+    <w:name w:val="Title Char"/>
+    <w:basedOn w:val="DefaultParagraphFont"/>
+    <w:link w:val="Title"/>
+    <w:uiPriority w:val="10"/>
+    <w:rsid w:val="00A10FD9"/>
+    <w:rPr>
+      <w:rFonts w:asciiTheme="majorHAnsi" w:eastAsiaTheme="majorEastAsia" w:hAnsiTheme="majorHAnsi" w:cstheme="majorBidi"/>
+      <w:sz w:val="56"/>
+      <w:szCs w:val="56"/>
+    </w:rPr>
+  </w:style>
+  <w:style w:type="paragraph" w:styleId="Subtitle">
+    <w:name w:val="Subtitle"/>
+    <w:basedOn w:val="Title"/>
+    <w:next w:val="BodyText"/>
+    <w:link w:val="SubtitleChar"/>
+    <w:uiPriority w:val="11"/>
+    <w:qFormat/>
+    <w:rsid w:val="00A10FD9"/>
+    <w:pPr>
+      <w:numPr>
+        <w:ilvl w:val="1"/>
+      </w:numPr>
+    </w:pPr>
+    <w:rPr>
+      <w:spacing w:val="15"/>
+      <w:sz w:val="28"/>
+      <w:szCs w:val="28"/>
+    </w:rPr>
+  </w:style>
+  <w:style w:type="character" w:customStyle="1" w:styleId="SubtitleChar">
+    <w:name w:val="Subtitle Char"/>
+    <w:basedOn w:val="DefaultParagraphFont"/>
+    <w:link w:val="Subtitle"/>
+    <w:uiPriority w:val="11"/>
+    <w:rsid w:val="00A10FD9"/>
+    <w:rPr>
+      <w:rFonts w:eastAsiaTheme="majorEastAsia" w:cstheme="majorBidi"/>
+      <w:color w:val="595959" w:themeColor="text1" w:themeTint="A6"/>
+      <w:spacing w:val="15"/>
+      <w:sz w:val="28"/>
+      <w:szCs w:val="28"/>
+    </w:rPr>
+  </w:style>
+  <w:style w:type="paragraph" w:customStyle="1" w:styleId="Author">
+    <w:name w:val="Author"/>
+    <w:basedOn w:val="Title"/>
+    <w:next w:val="BodyText"/>
+    <w:qFormat/>
+    <w:pPr>
+      <w:keepNext/>
+      <w:keepLines/>
+    </w:pPr>
+    <w:rPr>
+      <w:sz w:val="24"/>
+      <w:szCs w:val="24"/>
+    </w:rPr>
+  </w:style>
+  <w:style w:type="paragraph" w:styleId="Date">
+    <w:name w:val="Date"/>
+    <w:basedOn w:val="Title"/>
+    <w:next w:val="BodyText"/>
+    <w:qFormat/>
+    <w:pPr>
+      <w:keepNext/>
+      <w:keepLines/>
+    </w:pPr>
+    <w:rPr>
+      <w:sz w:val="24"/>
+      <w:szCs w:val="24"/>
+    </w:rPr>
+  </w:style>
+  <w:style w:type="paragraph" w:customStyle="1" w:styleId="AbstractTitle">
+    <w:name w:val="Abstract Title"/>
+    <w:basedOn w:val="Normal"/>
+    <w:next w:val="Abstract"/>
+    <w:qFormat/>
+    <w:pPr>
+      <w:keepNext/>
+      <w:keepLines/>
+      <w:spacing w:before="300" w:after="0"/>
+      <w:jc w:val="center"/>
+    </w:pPr>
+    <w:rPr>
+      <w:b/>
+      <w:sz w:val="20"/>
+      <w:szCs w:val="20"/>
+    </w:rPr>
+  </w:style>
+  <w:style w:type="paragraph" w:customStyle="1" w:styleId="Abstract">
+    <w:name w:val="Abstract"/>
+    <w:basedOn w:val="Normal"/>
+    <w:next w:val="BodyText"/>
+    <w:qFormat/>
+    <w:pPr>
+      <w:keepNext/>
+      <w:keepLines/>
+      <w:spacing w:before="100" w:after="300"/>
+    </w:pPr>
+    <w:rPr>
+      <w:sz w:val="20"/>
+      <w:szCs w:val="20"/>
+    </w:rPr>
+  </w:style>
+  <w:style w:type="paragraph" w:styleId="Bibliography">
+    <w:name w:val="Bibliography"/>
+    <w:basedOn w:val="Normal"/>
+    <w:qFormat/>
+  </w:style>
+  <w:style w:type="character" w:customStyle="1" w:styleId="Heading1Char">
     <w:name w:val="Heading 1 Char"/>
     <w:basedOn w:val="DefaultParagraphFont"/>
     <w:link w:val="Heading1"/>
     <w:uiPriority w:val="9"/>
     <w:rsid w:val="00A10FD9"/>
     <w:rPr>
-      <w:rFonts w:asciiTheme="majorHAnsi" w:cstheme="majorBidi" w:eastAsiaTheme="majorEastAsia" w:hAnsiTheme="majorHAnsi"/>
-      <w:color w:themeColor="accent1" w:themeShade="BF" w:val="0F4761"/>
+      <w:rFonts w:asciiTheme="majorHAnsi" w:eastAsiaTheme="majorEastAsia" w:hAnsiTheme="majorHAnsi" w:cstheme="majorBidi"/>
+      <w:color w:val="0F4761" w:themeColor="accent1" w:themeShade="BF"/>
       <w:sz w:val="40"/>
       <w:szCs w:val="40"/>
     </w:rPr>
   </w:style>
-  <w:style w:customStyle="1" w:styleId="Heading2Char" w:type="character">
+  <w:style w:type="character" w:customStyle="1" w:styleId="Heading2Char">
     <w:name w:val="Heading 2 Char"/>
     <w:basedOn w:val="DefaultParagraphFont"/>
     <w:link w:val="Heading2"/>
@@ -1684,13 +1887,13 @@
     <w:semiHidden/>
     <w:rsid w:val="00A10FD9"/>
     <w:rPr>
-      <w:rFonts w:asciiTheme="majorHAnsi" w:cstheme="majorBidi" w:eastAsiaTheme="majorEastAsia" w:hAnsiTheme="majorHAnsi"/>
-      <w:color w:themeColor="accent1" w:themeShade="BF" w:val="0F4761"/>
+      <w:rFonts w:asciiTheme="majorHAnsi" w:eastAsiaTheme="majorEastAsia" w:hAnsiTheme="majorHAnsi" w:cstheme="majorBidi"/>
+      <w:color w:val="0F4761" w:themeColor="accent1" w:themeShade="BF"/>
       <w:sz w:val="32"/>
       <w:szCs w:val="32"/>
     </w:rPr>
   </w:style>
-  <w:style w:customStyle="1" w:styleId="Heading3Char" w:type="character">
+  <w:style w:type="character" w:customStyle="1" w:styleId="Heading3Char">
     <w:name w:val="Heading 3 Char"/>
     <w:basedOn w:val="DefaultParagraphFont"/>
     <w:link w:val="Heading3"/>
@@ -1698,13 +1901,13 @@
     <w:semiHidden/>
     <w:rsid w:val="00A10FD9"/>
     <w:rPr>
-      <w:rFonts w:cstheme="majorBidi" w:eastAsiaTheme="majorEastAsia"/>
-      <w:color w:themeColor="accent1" w:themeShade="BF" w:val="0F4761"/>
+      <w:rFonts w:eastAsiaTheme="majorEastAsia" w:cstheme="majorBidi"/>
+      <w:color w:val="0F4761" w:themeColor="accent1" w:themeShade="BF"/>
       <w:sz w:val="28"/>
       <w:szCs w:val="28"/>
     </w:rPr>
   </w:style>
-  <w:style w:customStyle="1" w:styleId="Heading4Char" w:type="character">
+  <w:style w:type="character" w:customStyle="1" w:styleId="Heading4Char">
     <w:name w:val="Heading 4 Char"/>
     <w:basedOn w:val="DefaultParagraphFont"/>
     <w:link w:val="Heading4"/>
@@ -1712,13 +1915,13 @@
     <w:semiHidden/>
     <w:rsid w:val="00A10FD9"/>
     <w:rPr>
-      <w:rFonts w:cstheme="majorBidi" w:eastAsiaTheme="majorEastAsia"/>
+      <w:rFonts w:eastAsiaTheme="majorEastAsia" w:cstheme="majorBidi"/>
       <w:i/>
       <w:iCs/>
-      <w:color w:themeColor="accent1" w:themeShade="BF" w:val="0F4761"/>
-    </w:rPr>
-  </w:style>
-  <w:style w:customStyle="1" w:styleId="Heading5Char" w:type="character">
+      <w:color w:val="0F4761" w:themeColor="accent1" w:themeShade="BF"/>
+    </w:rPr>
+  </w:style>
+  <w:style w:type="character" w:customStyle="1" w:styleId="Heading5Char">
     <w:name w:val="Heading 5 Char"/>
     <w:basedOn w:val="DefaultParagraphFont"/>
     <w:link w:val="Heading5"/>
@@ -1726,11 +1929,11 @@
     <w:semiHidden/>
     <w:rsid w:val="00A10FD9"/>
     <w:rPr>
-      <w:rFonts w:cstheme="majorBidi" w:eastAsiaTheme="majorEastAsia"/>
-      <w:color w:themeColor="accent1" w:themeShade="BF" w:val="0F4761"/>
-    </w:rPr>
-  </w:style>
-  <w:style w:customStyle="1" w:styleId="Heading6Char" w:type="character">
+      <w:rFonts w:eastAsiaTheme="majorEastAsia" w:cstheme="majorBidi"/>
+      <w:color w:val="0F4761" w:themeColor="accent1" w:themeShade="BF"/>
+    </w:rPr>
+  </w:style>
+  <w:style w:type="character" w:customStyle="1" w:styleId="Heading6Char">
     <w:name w:val="Heading 6 Char"/>
     <w:basedOn w:val="DefaultParagraphFont"/>
     <w:link w:val="Heading6"/>
@@ -1738,13 +1941,13 @@
     <w:semiHidden/>
     <w:rsid w:val="00A10FD9"/>
     <w:rPr>
-      <w:rFonts w:cstheme="majorBidi" w:eastAsiaTheme="majorEastAsia"/>
+      <w:rFonts w:eastAsiaTheme="majorEastAsia" w:cstheme="majorBidi"/>
       <w:i/>
       <w:iCs/>
-      <w:color w:themeColor="text1" w:themeTint="A6" w:val="595959"/>
-    </w:rPr>
-  </w:style>
-  <w:style w:customStyle="1" w:styleId="Heading7Char" w:type="character">
+      <w:color w:val="595959" w:themeColor="text1" w:themeTint="A6"/>
+    </w:rPr>
+  </w:style>
+  <w:style w:type="character" w:customStyle="1" w:styleId="Heading7Char">
     <w:name w:val="Heading 7 Char"/>
     <w:basedOn w:val="DefaultParagraphFont"/>
     <w:link w:val="Heading7"/>
@@ -1752,11 +1955,11 @@
     <w:semiHidden/>
     <w:rsid w:val="00A10FD9"/>
     <w:rPr>
-      <w:rFonts w:cstheme="majorBidi" w:eastAsiaTheme="majorEastAsia"/>
-      <w:color w:themeColor="text1" w:themeTint="A6" w:val="595959"/>
-    </w:rPr>
-  </w:style>
-  <w:style w:customStyle="1" w:styleId="Heading8Char" w:type="character">
+      <w:rFonts w:eastAsiaTheme="majorEastAsia" w:cstheme="majorBidi"/>
+      <w:color w:val="595959" w:themeColor="text1" w:themeTint="A6"/>
+    </w:rPr>
+  </w:style>
+  <w:style w:type="character" w:customStyle="1" w:styleId="Heading8Char">
     <w:name w:val="Heading 8 Char"/>
     <w:basedOn w:val="DefaultParagraphFont"/>
     <w:link w:val="Heading8"/>
@@ -1764,13 +1967,13 @@
     <w:semiHidden/>
     <w:rsid w:val="00A10FD9"/>
     <w:rPr>
-      <w:rFonts w:cstheme="majorBidi" w:eastAsiaTheme="majorEastAsia"/>
+      <w:rFonts w:eastAsiaTheme="majorEastAsia" w:cstheme="majorBidi"/>
       <w:i/>
       <w:iCs/>
-      <w:color w:themeColor="text1" w:themeTint="D8" w:val="272727"/>
-    </w:rPr>
-  </w:style>
-  <w:style w:customStyle="1" w:styleId="Heading9Char" w:type="character">
+      <w:color w:val="272727" w:themeColor="text1" w:themeTint="D8"/>
+    </w:rPr>
+  </w:style>
+  <w:style w:type="character" w:customStyle="1" w:styleId="Heading9Char">
     <w:name w:val="Heading 9 Char"/>
     <w:basedOn w:val="DefaultParagraphFont"/>
     <w:link w:val="Heading9"/>
@@ -1778,11 +1981,11 @@
     <w:semiHidden/>
     <w:rsid w:val="00A10FD9"/>
     <w:rPr>
-      <w:rFonts w:cstheme="majorBidi" w:eastAsiaTheme="majorEastAsia"/>
-      <w:color w:themeColor="text1" w:themeTint="D8" w:val="272727"/>
-    </w:rPr>
-  </w:style>
-  <w:style w:styleId="BlockText" w:type="paragraph">
+      <w:rFonts w:eastAsiaTheme="majorEastAsia" w:cstheme="majorBidi"/>
+      <w:color w:val="272727" w:themeColor="text1" w:themeTint="D8"/>
+    </w:rPr>
+  </w:style>
+  <w:style w:type="paragraph" w:styleId="BlockText">
     <w:name w:val="Block Text"/>
     <w:basedOn w:val="BodyText"/>
     <w:next w:val="BodyText"/>
@@ -1790,19 +1993,18 @@
     <w:unhideWhenUsed/>
     <w:qFormat/>
     <w:pPr>
-      <w:spacing w:after="100" w:before="100"/>
-      <w:ind w:firstLine="0" w:left="480" w:right="480"/>
+      <w:spacing w:before="100" w:after="100"/>
+      <w:ind w:left="480" w:right="480"/>
     </w:pPr>
   </w:style>
-  <w:style w:styleId="FootnoteText" w:type="paragraph">
-    <w:name w:val="Footnote Text"/>
+  <w:style w:type="paragraph" w:styleId="FootnoteText">
+    <w:name w:val="footnote text"/>
     <w:basedOn w:val="Normal"/>
-    <w:next w:val="FootnoteText"/>
     <w:uiPriority w:val="9"/>
     <w:unhideWhenUsed/>
     <w:qFormat/>
   </w:style>
-  <w:style w:styleId="FootnoteBlockText" w:type="paragraph">
+  <w:style w:type="paragraph" w:customStyle="1" w:styleId="FootnoteBlockText">
     <w:name w:val="Footnote Block Text"/>
     <w:basedOn w:val="FootnoteText"/>
     <w:next w:val="FootnoteText"/>
@@ -1810,40 +2012,35 @@
     <w:unhideWhenUsed/>
     <w:qFormat/>
     <w:pPr>
-      <w:spacing w:after="100" w:before="100"/>
-      <w:ind w:firstLine="0" w:left="480" w:right="480"/>
+      <w:spacing w:before="100" w:after="100"/>
+      <w:ind w:left="480" w:right="480"/>
     </w:pPr>
   </w:style>
-  <w:style w:default="1" w:styleId="DefaultParagraphFont" w:type="character">
-    <w:name w:val="Default Paragraph Font"/>
-    <w:semiHidden/>
-    <w:unhideWhenUsed/>
-  </w:style>
-  <w:style w:default="1" w:styleId="Table" w:type="table">
+  <w:style w:type="table" w:customStyle="1" w:styleId="Table">
     <w:name w:val="Table"/>
-    <w:basedOn w:val="TableNormal"/>
     <w:semiHidden/>
     <w:unhideWhenUsed/>
     <w:qFormat/>
     <w:tblPr>
-      <w:tblInd w:type="dxa" w:w="0"/>
+      <w:tblInd w:w="0" w:type="dxa"/>
       <w:tblCellMar>
-        <w:top w:type="dxa" w:w="0"/>
-        <w:left w:type="dxa" w:w="108"/>
-        <w:bottom w:type="dxa" w:w="0"/>
-        <w:right w:type="dxa" w:w="108"/>
+        <w:top w:w="0" w:type="dxa"/>
+        <w:left w:w="108" w:type="dxa"/>
+        <w:bottom w:w="0" w:type="dxa"/>
+        <w:right w:w="108" w:type="dxa"/>
       </w:tblCellMar>
     </w:tblPr>
     <w:tblStylePr w:type="firstRow">
+      <w:tblPr/>
       <w:tcPr>
         <w:tcBorders>
-          <w:bottom w:val="single"/>
+          <w:bottom w:val="single" w:sz="0" w:space="0" w:color="auto"/>
         </w:tcBorders>
         <w:vAlign w:val="bottom"/>
       </w:tcPr>
     </w:tblStylePr>
   </w:style>
-  <w:style w:customStyle="1" w:styleId="DefinitionTerm" w:type="paragraph">
+  <w:style w:type="paragraph" w:customStyle="1" w:styleId="DefinitionTerm">
     <w:name w:val="Definition Term"/>
     <w:basedOn w:val="Normal"/>
     <w:next w:val="Definition"/>
@@ -1856,75 +2053,76 @@
       <w:b/>
     </w:rPr>
   </w:style>
-  <w:style w:customStyle="1" w:styleId="Definition" w:type="paragraph">
+  <w:style w:type="paragraph" w:customStyle="1" w:styleId="Definition">
     <w:name w:val="Definition"/>
     <w:basedOn w:val="Normal"/>
   </w:style>
-  <w:style w:styleId="Caption" w:type="paragraph">
-    <w:name w:val="Caption"/>
+  <w:style w:type="paragraph" w:styleId="Caption">
+    <w:name w:val="caption"/>
     <w:basedOn w:val="Normal"/>
-    <w:link w:val="BodyTextChar"/>
+    <w:link w:val="CaptionChar"/>
     <w:pPr>
-      <w:spacing w:after="120" w:before="0"/>
+      <w:spacing w:after="120"/>
     </w:pPr>
     <w:rPr>
       <w:i/>
     </w:rPr>
   </w:style>
-  <w:style w:customStyle="1" w:styleId="TableCaption" w:type="paragraph">
+  <w:style w:type="paragraph" w:customStyle="1" w:styleId="TableCaption">
     <w:name w:val="Table Caption"/>
     <w:basedOn w:val="Caption"/>
     <w:pPr>
       <w:keepNext/>
     </w:pPr>
   </w:style>
-  <w:style w:customStyle="1" w:styleId="ImageCaption" w:type="paragraph">
+  <w:style w:type="paragraph" w:customStyle="1" w:styleId="ImageCaption">
     <w:name w:val="Image Caption"/>
     <w:basedOn w:val="Caption"/>
   </w:style>
-  <w:style w:customStyle="1" w:styleId="Figure" w:type="paragraph">
+  <w:style w:type="paragraph" w:customStyle="1" w:styleId="Figure">
     <w:name w:val="Figure"/>
     <w:basedOn w:val="Normal"/>
   </w:style>
-  <w:style w:customStyle="1" w:styleId="CaptionedFigure" w:type="paragraph">
+  <w:style w:type="paragraph" w:customStyle="1" w:styleId="CaptionedFigure">
     <w:name w:val="Captioned Figure"/>
     <w:basedOn w:val="Figure"/>
     <w:pPr>
       <w:keepNext/>
     </w:pPr>
   </w:style>
-  <w:style w:customStyle="1" w:styleId="BodyTextChar" w:type="character">
-    <w:name w:val="Body Text Char"/>
+  <w:style w:type="character" w:customStyle="1" w:styleId="CaptionChar">
+    <w:name w:val="Caption Char"/>
     <w:basedOn w:val="DefaultParagraphFont"/>
-    <w:link w:val="BodyText"/>
-  </w:style>
-  <w:style w:customStyle="1" w:styleId="VerbatimChar" w:type="character">
+    <w:link w:val="Caption"/>
+  </w:style>
+  <w:style w:type="character" w:customStyle="1" w:styleId="VerbatimChar">
     <w:name w:val="Verbatim Char"/>
-    <w:basedOn w:val="BodyTextChar"/>
-    <w:rPr>
-      <w:rFonts w:ascii="Consolas" w:hAnsi="Consolas"/>
-      <w:sz w:val="22"/>
-    </w:rPr>
-  </w:style>
-  <w:style w:customStyle="1" w:styleId="SectionNumber" w:type="character">
+    <w:basedOn w:val="CaptionChar"/>
+    <w:link w:val="SourceCode"/>
+    <w:rPr>
+      <w:rFonts w:ascii="Consolas" w:hAnsi="Consolas"/>
+      <w:sz w:val="22"/>
+    </w:rPr>
+  </w:style>
+  <w:style w:type="character" w:customStyle="1" w:styleId="SectionNumber">
     <w:name w:val="Section Number"/>
-    <w:basedOn w:val="BodyTextChar"/>
-  </w:style>
-  <w:style w:styleId="FootnoteReference" w:type="character">
-    <w:name w:val="Footnote Reference"/>
-    <w:basedOn w:val="BodyTextChar"/>
+    <w:basedOn w:val="CaptionChar"/>
+  </w:style>
+  <w:style w:type="character" w:styleId="FootnoteReference">
+    <w:name w:val="footnote reference"/>
+    <w:basedOn w:val="CaptionChar"/>
     <w:rPr>
       <w:vertAlign w:val="superscript"/>
     </w:rPr>
   </w:style>
-  <w:style w:styleId="Hyperlink" w:type="character">
+  <w:style w:type="character" w:styleId="Hyperlink">
     <w:name w:val="Hyperlink"/>
-    <w:basedOn w:val="BodyTextChar"/>
-    <w:rPr>
-      <w:color w:themeColor="accent1" w:val="4F81BD"/>
-    </w:rPr>
-  </w:style>
-  <w:style w:styleId="TOCHeading" w:type="paragraph">
+    <w:basedOn w:val="CaptionChar"/>
+    <w:rPr>
+      <w:color w:val="156082" w:themeColor="accent1"/>
+    </w:rPr>
+  </w:style>
+  <w:style w:type="paragraph" w:styleId="TOCHeading">
     <w:name w:val="TOC Heading"/>
     <w:basedOn w:val="Heading1"/>
     <w:next w:val="BodyText"/>
@@ -1935,246 +2133,305 @@
       <w:spacing w:before="240" w:line="259" w:lineRule="auto"/>
       <w:outlineLvl w:val="9"/>
     </w:pPr>
-    <w:rPr>
-      <w:rFonts w:asciiTheme="majorHAnsi" w:cstheme="majorBidi" w:eastAsiaTheme="majorEastAsia" w:hAnsiTheme="majorHAnsi"/>
-      <w:b w:val="0"/>
-      <w:bCs w:val="0"/>
-      <w:color w:themeColor="accent1" w:themeShade="BF" w:val="365F91"/>
-    </w:rPr>
   </w:style>
   <w:style w:type="paragraph" w:customStyle="1" w:styleId="SourceCode">
     <w:name w:val="Source Code"/>
     <w:basedOn w:val="Normal"/>
     <w:link w:val="VerbatimChar"/>
     <w:pPr>
-      <w:wordWrap w:val="off"/>
+      <w:wordWrap w:val="0"/>
     </w:pPr>
   </w:style>
   <w:style w:type="character" w:customStyle="1" w:styleId="KeywordTok">
     <w:name w:val="KeywordTok"/>
     <w:basedOn w:val="VerbatimChar"/>
     <w:rPr>
+      <w:rFonts w:ascii="Consolas" w:hAnsi="Consolas"/>
       <w:b/>
       <w:color w:val="007020"/>
+      <w:sz w:val="22"/>
     </w:rPr>
   </w:style>
   <w:style w:type="character" w:customStyle="1" w:styleId="DataTypeTok">
     <w:name w:val="DataTypeTok"/>
     <w:basedOn w:val="VerbatimChar"/>
     <w:rPr>
+      <w:rFonts w:ascii="Consolas" w:hAnsi="Consolas"/>
       <w:color w:val="902000"/>
+      <w:sz w:val="22"/>
     </w:rPr>
   </w:style>
   <w:style w:type="character" w:customStyle="1" w:styleId="DecValTok">
     <w:name w:val="DecValTok"/>
     <w:basedOn w:val="VerbatimChar"/>
     <w:rPr>
-      <w:color w:val="40a070"/>
+      <w:rFonts w:ascii="Consolas" w:hAnsi="Consolas"/>
+      <w:color w:val="40A070"/>
+      <w:sz w:val="22"/>
     </w:rPr>
   </w:style>
   <w:style w:type="character" w:customStyle="1" w:styleId="BaseNTok">
     <w:name w:val="BaseNTok"/>
     <w:basedOn w:val="VerbatimChar"/>
     <w:rPr>
-      <w:color w:val="40a070"/>
+      <w:rFonts w:ascii="Consolas" w:hAnsi="Consolas"/>
+      <w:color w:val="40A070"/>
+      <w:sz w:val="22"/>
     </w:rPr>
   </w:style>
   <w:style w:type="character" w:customStyle="1" w:styleId="FloatTok">
     <w:name w:val="FloatTok"/>
     <w:basedOn w:val="VerbatimChar"/>
     <w:rPr>
-      <w:color w:val="40a070"/>
+      <w:rFonts w:ascii="Consolas" w:hAnsi="Consolas"/>
+      <w:color w:val="40A070"/>
+      <w:sz w:val="22"/>
     </w:rPr>
   </w:style>
   <w:style w:type="character" w:customStyle="1" w:styleId="ConstantTok">
     <w:name w:val="ConstantTok"/>
     <w:basedOn w:val="VerbatimChar"/>
     <w:rPr>
+      <w:rFonts w:ascii="Consolas" w:hAnsi="Consolas"/>
       <w:color w:val="880000"/>
+      <w:sz w:val="22"/>
     </w:rPr>
   </w:style>
   <w:style w:type="character" w:customStyle="1" w:styleId="CharTok">
     <w:name w:val="CharTok"/>
     <w:basedOn w:val="VerbatimChar"/>
     <w:rPr>
-      <w:color w:val="4070a0"/>
+      <w:rFonts w:ascii="Consolas" w:hAnsi="Consolas"/>
+      <w:color w:val="4070A0"/>
+      <w:sz w:val="22"/>
     </w:rPr>
   </w:style>
   <w:style w:type="character" w:customStyle="1" w:styleId="SpecialCharTok">
     <w:name w:val="SpecialCharTok"/>
     <w:basedOn w:val="VerbatimChar"/>
     <w:rPr>
-      <w:color w:val="4070a0"/>
+      <w:rFonts w:ascii="Consolas" w:hAnsi="Consolas"/>
+      <w:color w:val="4070A0"/>
+      <w:sz w:val="22"/>
     </w:rPr>
   </w:style>
   <w:style w:type="character" w:customStyle="1" w:styleId="StringTok">
     <w:name w:val="StringTok"/>
     <w:basedOn w:val="VerbatimChar"/>
     <w:rPr>
-      <w:color w:val="4070a0"/>
+      <w:rFonts w:ascii="Consolas" w:hAnsi="Consolas"/>
+      <w:color w:val="4070A0"/>
+      <w:sz w:val="22"/>
     </w:rPr>
   </w:style>
   <w:style w:type="character" w:customStyle="1" w:styleId="VerbatimStringTok">
     <w:name w:val="VerbatimStringTok"/>
     <w:basedOn w:val="VerbatimChar"/>
     <w:rPr>
-      <w:color w:val="4070a0"/>
+      <w:rFonts w:ascii="Consolas" w:hAnsi="Consolas"/>
+      <w:color w:val="4070A0"/>
+      <w:sz w:val="22"/>
     </w:rPr>
   </w:style>
   <w:style w:type="character" w:customStyle="1" w:styleId="SpecialStringTok">
     <w:name w:val="SpecialStringTok"/>
     <w:basedOn w:val="VerbatimChar"/>
     <w:rPr>
-      <w:color w:val="bb6688"/>
+      <w:rFonts w:ascii="Consolas" w:hAnsi="Consolas"/>
+      <w:color w:val="BB6688"/>
+      <w:sz w:val="22"/>
     </w:rPr>
   </w:style>
   <w:style w:type="character" w:customStyle="1" w:styleId="ImportTok">
     <w:name w:val="ImportTok"/>
     <w:basedOn w:val="VerbatimChar"/>
     <w:rPr>
+      <w:rFonts w:ascii="Consolas" w:hAnsi="Consolas"/>
       <w:b/>
       <w:color w:val="008000"/>
+      <w:sz w:val="22"/>
     </w:rPr>
   </w:style>
   <w:style w:type="character" w:customStyle="1" w:styleId="CommentTok">
     <w:name w:val="CommentTok"/>
     <w:basedOn w:val="VerbatimChar"/>
     <w:rPr>
+      <w:rFonts w:ascii="Consolas" w:hAnsi="Consolas"/>
       <w:i/>
-      <w:color w:val="60a0b0"/>
+      <w:color w:val="60A0B0"/>
+      <w:sz w:val="22"/>
     </w:rPr>
   </w:style>
   <w:style w:type="character" w:customStyle="1" w:styleId="DocumentationTok">
     <w:name w:val="DocumentationTok"/>
     <w:basedOn w:val="VerbatimChar"/>
     <w:rPr>
+      <w:rFonts w:ascii="Consolas" w:hAnsi="Consolas"/>
       <w:i/>
-      <w:color w:val="ba2121"/>
+      <w:color w:val="BA2121"/>
+      <w:sz w:val="22"/>
     </w:rPr>
   </w:style>
   <w:style w:type="character" w:customStyle="1" w:styleId="AnnotationTok">
     <w:name w:val="AnnotationTok"/>
     <w:basedOn w:val="VerbatimChar"/>
     <w:rPr>
+      <w:rFonts w:ascii="Consolas" w:hAnsi="Consolas"/>
       <w:b/>
       <w:i/>
-      <w:color w:val="60a0b0"/>
+      <w:color w:val="60A0B0"/>
+      <w:sz w:val="22"/>
     </w:rPr>
   </w:style>
   <w:style w:type="character" w:customStyle="1" w:styleId="CommentVarTok">
     <w:name w:val="CommentVarTok"/>
     <w:basedOn w:val="VerbatimChar"/>
     <w:rPr>
+      <w:rFonts w:ascii="Consolas" w:hAnsi="Consolas"/>
       <w:b/>
       <w:i/>
-      <w:color w:val="60a0b0"/>
+      <w:color w:val="60A0B0"/>
+      <w:sz w:val="22"/>
     </w:rPr>
   </w:style>
   <w:style w:type="character" w:customStyle="1" w:styleId="OtherTok">
     <w:name w:val="OtherTok"/>
     <w:basedOn w:val="VerbatimChar"/>
     <w:rPr>
+      <w:rFonts w:ascii="Consolas" w:hAnsi="Consolas"/>
       <w:color w:val="007020"/>
+      <w:sz w:val="22"/>
     </w:rPr>
   </w:style>
   <w:style w:type="character" w:customStyle="1" w:styleId="FunctionTok">
     <w:name w:val="FunctionTok"/>
     <w:basedOn w:val="VerbatimChar"/>
     <w:rPr>
-      <w:color w:val="06287e"/>
+      <w:rFonts w:ascii="Consolas" w:hAnsi="Consolas"/>
+      <w:color w:val="06287E"/>
+      <w:sz w:val="22"/>
     </w:rPr>
   </w:style>
   <w:style w:type="character" w:customStyle="1" w:styleId="VariableTok">
     <w:name w:val="VariableTok"/>
     <w:basedOn w:val="VerbatimChar"/>
     <w:rPr>
-      <w:color w:val="19177c"/>
+      <w:rFonts w:ascii="Consolas" w:hAnsi="Consolas"/>
+      <w:color w:val="19177C"/>
+      <w:sz w:val="22"/>
     </w:rPr>
   </w:style>
   <w:style w:type="character" w:customStyle="1" w:styleId="ControlFlowTok">
     <w:name w:val="ControlFlowTok"/>
     <w:basedOn w:val="VerbatimChar"/>
     <w:rPr>
+      <w:rFonts w:ascii="Consolas" w:hAnsi="Consolas"/>
       <w:b/>
       <w:color w:val="007020"/>
+      <w:sz w:val="22"/>
     </w:rPr>
   </w:style>
   <w:style w:type="character" w:customStyle="1" w:styleId="OperatorTok">
     <w:name w:val="OperatorTok"/>
     <w:basedOn w:val="VerbatimChar"/>
     <w:rPr>
+      <w:rFonts w:ascii="Consolas" w:hAnsi="Consolas"/>
       <w:color w:val="666666"/>
+      <w:sz w:val="22"/>
     </w:rPr>
   </w:style>
   <w:style w:type="character" w:customStyle="1" w:styleId="BuiltInTok">
     <w:name w:val="BuiltInTok"/>
     <w:basedOn w:val="VerbatimChar"/>
     <w:rPr>
+      <w:rFonts w:ascii="Consolas" w:hAnsi="Consolas"/>
       <w:color w:val="008000"/>
+      <w:sz w:val="22"/>
     </w:rPr>
   </w:style>
   <w:style w:type="character" w:customStyle="1" w:styleId="ExtensionTok">
     <w:name w:val="ExtensionTok"/>
     <w:basedOn w:val="VerbatimChar"/>
-    <w:rPr/>
+    <w:rPr>
+      <w:rFonts w:ascii="Consolas" w:hAnsi="Consolas"/>
+      <w:sz w:val="22"/>
+    </w:rPr>
   </w:style>
   <w:style w:type="character" w:customStyle="1" w:styleId="PreprocessorTok">
     <w:name w:val="PreprocessorTok"/>
     <w:basedOn w:val="VerbatimChar"/>
     <w:rPr>
-      <w:color w:val="bc7a00"/>
+      <w:rFonts w:ascii="Consolas" w:hAnsi="Consolas"/>
+      <w:color w:val="BC7A00"/>
+      <w:sz w:val="22"/>
     </w:rPr>
   </w:style>
   <w:style w:type="character" w:customStyle="1" w:styleId="AttributeTok">
     <w:name w:val="AttributeTok"/>
     <w:basedOn w:val="VerbatimChar"/>
     <w:rPr>
-      <w:color w:val="7d9029"/>
+      <w:rFonts w:ascii="Consolas" w:hAnsi="Consolas"/>
+      <w:color w:val="7D9029"/>
+      <w:sz w:val="22"/>
     </w:rPr>
   </w:style>
   <w:style w:type="character" w:customStyle="1" w:styleId="RegionMarkerTok">
     <w:name w:val="RegionMarkerTok"/>
     <w:basedOn w:val="VerbatimChar"/>
-    <w:rPr/>
+    <w:rPr>
+      <w:rFonts w:ascii="Consolas" w:hAnsi="Consolas"/>
+      <w:sz w:val="22"/>
+    </w:rPr>
   </w:style>
   <w:style w:type="character" w:customStyle="1" w:styleId="InformationTok">
     <w:name w:val="InformationTok"/>
     <w:basedOn w:val="VerbatimChar"/>
     <w:rPr>
+      <w:rFonts w:ascii="Consolas" w:hAnsi="Consolas"/>
       <w:b/>
       <w:i/>
-      <w:color w:val="60a0b0"/>
+      <w:color w:val="60A0B0"/>
+      <w:sz w:val="22"/>
     </w:rPr>
   </w:style>
   <w:style w:type="character" w:customStyle="1" w:styleId="WarningTok">
     <w:name w:val="WarningTok"/>
     <w:basedOn w:val="VerbatimChar"/>
     <w:rPr>
+      <w:rFonts w:ascii="Consolas" w:hAnsi="Consolas"/>
       <w:b/>
       <w:i/>
-      <w:color w:val="60a0b0"/>
+      <w:color w:val="60A0B0"/>
+      <w:sz w:val="22"/>
     </w:rPr>
   </w:style>
   <w:style w:type="character" w:customStyle="1" w:styleId="AlertTok">
     <w:name w:val="AlertTok"/>
     <w:basedOn w:val="VerbatimChar"/>
     <w:rPr>
+      <w:rFonts w:ascii="Consolas" w:hAnsi="Consolas"/>
       <w:b/>
-      <w:color w:val="ff0000"/>
+      <w:color w:val="FF0000"/>
+      <w:sz w:val="22"/>
     </w:rPr>
   </w:style>
   <w:style w:type="character" w:customStyle="1" w:styleId="ErrorTok">
     <w:name w:val="ErrorTok"/>
     <w:basedOn w:val="VerbatimChar"/>
     <w:rPr>
+      <w:rFonts w:ascii="Consolas" w:hAnsi="Consolas"/>
       <w:b/>
-      <w:color w:val="ff0000"/>
+      <w:color w:val="FF0000"/>
+      <w:sz w:val="22"/>
     </w:rPr>
   </w:style>
   <w:style w:type="character" w:customStyle="1" w:styleId="NormalTok">
     <w:name w:val="NormalTok"/>
     <w:basedOn w:val="VerbatimChar"/>
-    <w:rPr/>
+    <w:rPr>
+      <w:rFonts w:ascii="Consolas" w:hAnsi="Consolas"/>
+      <w:sz w:val="22"/>
+    </w:rPr>
   </w:style>
 </w:styles>
 </file>

</xml_diff>